<commit_message>
Update CV with new projects and graduation, add PDF version
- CV: rewritten summary; key projects now Mokoji, Al-Fardos Factory,
  Al-Fardos Management and Length Factory (BMI replaced by an "Also" line);
  experience, education (graduated 2026) and skills match the site;
  added Portfolio and LinkedIn links; same layout and colors as before
- Add Osama_Yosef_CV.pdf; Resume opens it in a new tab, download buttons
  now download the PDF
- Version query on style.css/script.js so browsers fetch the new files
  after a deploy instead of mixing cached assets

Co-Authored-By: Claude Opus 5.5 <noreply@anthropic.com>
Claude-Session: https://claude.ai/code/session_01CvPfAjhWvduUgH3U9iMkQ7
</commit_message>
<xml_diff>
--- a/assets/docs/Osama_Yosef_CV.docx
+++ b/assets/docs/Osama_Yosef_CV.docx
@@ -31,7 +31,22 @@
           <w:sz w:val="22"/>
           <w:szCs w:val="22"/>
         </w:rPr>
-        <w:t xml:space="preserve">Flutter Developer  |  Mobile Apps for Business &amp; Industry</w:t>
+        <w:t xml:space="preserve">Flutter Developer  |  Business Systems for Android, Windows &amp; Web</w:t>
+      </w:r>
+    </w:p>
+    <w:p>
+      <w:pPr>
+        <w:spacing w:after="20" w:before="0"/>
+        <w:jc w:val="center"/>
+      </w:pPr>
+      <w:r>
+        <w:rPr>
+          <w:rFonts w:ascii="Arial" w:cs="Arial" w:eastAsia="Arial" w:hAnsi="Arial"/>
+          <w:color w:val="555555"/>
+          <w:sz w:val="19"/>
+          <w:szCs w:val="19"/>
+        </w:rPr>
+        <w:t xml:space="preserve">Cairo, Egypt  •  +20 109 652 5584  •  osamayosef038@gmail.com</w:t>
       </w:r>
     </w:p>
     <w:p>
@@ -39,6 +54,18 @@
         <w:spacing w:after="0" w:before="0"/>
         <w:jc w:val="center"/>
       </w:pPr>
+      <w:hyperlink w:history="1" r:id="rIdPortfolio">
+        <w:r>
+          <w:rPr>
+            <w:rFonts w:ascii="Arial" w:cs="Arial" w:eastAsia="Arial" w:hAnsi="Arial"/>
+            <w:color w:val="6B3FA0"/>
+            <w:sz w:val="19"/>
+            <w:szCs w:val="19"/>
+            <w:u w:val="single"/>
+          </w:rPr>
+          <w:t xml:space="preserve">Portfolio</w:t>
+        </w:r>
+      </w:hyperlink>
       <w:r>
         <w:rPr>
           <w:rFonts w:ascii="Arial" w:cs="Arial" w:eastAsia="Arial" w:hAnsi="Arial"/>
@@ -46,25 +73,7 @@
           <w:sz w:val="19"/>
           <w:szCs w:val="19"/>
         </w:rPr>
-        <w:t xml:space="preserve">Cairo, Egypt  •  </w:t>
-      </w:r>
-      <w:r>
-        <w:rPr>
-          <w:rFonts w:ascii="Arial" w:cs="Arial" w:eastAsia="Arial" w:hAnsi="Arial"/>
-          <w:color w:val="555555"/>
-          <w:sz w:val="19"/>
-          <w:szCs w:val="19"/>
-        </w:rPr>
-        <w:t xml:space="preserve">+20 109 652 5584  •  </w:t>
-      </w:r>
-      <w:r>
-        <w:rPr>
-          <w:rFonts w:ascii="Arial" w:cs="Arial" w:eastAsia="Arial" w:hAnsi="Arial"/>
-          <w:color w:val="555555"/>
-          <w:sz w:val="19"/>
-          <w:szCs w:val="19"/>
-        </w:rPr>
-        <w:t xml:space="preserve">osamayosef038@gmail.com  •  </w:t>
+        <w:t xml:space="preserve">  •  </w:t>
       </w:r>
       <w:hyperlink w:history="1" r:id="rId_ubyickvvhjxq2j9s5pwt">
         <w:r>
@@ -87,6 +96,27 @@
         </w:rPr>
         <w:t xml:space="preserve">  •  </w:t>
       </w:r>
+      <w:hyperlink w:history="1" r:id="rIdLinkedIn">
+        <w:r>
+          <w:rPr>
+            <w:rFonts w:ascii="Arial" w:cs="Arial" w:eastAsia="Arial" w:hAnsi="Arial"/>
+            <w:color w:val="6B3FA0"/>
+            <w:sz w:val="19"/>
+            <w:szCs w:val="19"/>
+            <w:u w:val="single"/>
+          </w:rPr>
+          <w:t xml:space="preserve">LinkedIn</w:t>
+        </w:r>
+      </w:hyperlink>
+      <w:r>
+        <w:rPr>
+          <w:rFonts w:ascii="Arial" w:cs="Arial" w:eastAsia="Arial" w:hAnsi="Arial"/>
+          <w:color w:val="555555"/>
+          <w:sz w:val="19"/>
+          <w:szCs w:val="19"/>
+        </w:rPr>
+        <w:t xml:space="preserve">  •  </w:t>
+      </w:r>
       <w:hyperlink w:history="1" r:id="rIdtej3svn_tfemk2cjkwr8-">
         <w:r>
           <w:rPr>
@@ -102,18 +132,11 @@
     </w:p>
     <w:p>
       <w:pPr>
-        <w:spacing w:after="0" w:before="120"/>
-      </w:pPr>
-      <w:r>
-        <w:t xml:space="preserve"/>
-      </w:r>
-    </w:p>
-    <w:p>
-      <w:pPr>
+        <w:keepNext/>
         <w:pBdr>
           <w:bottom w:val="single" w:color="6B3FA0" w:sz="4" w:space="4"/>
         </w:pBdr>
-        <w:spacing w:after="80" w:before="280"/>
+        <w:spacing w:after="80" w:before="240"/>
       </w:pPr>
       <w:r>
         <w:rPr>
@@ -138,23 +161,16 @@
           <w:sz w:val="20"/>
           <w:szCs w:val="20"/>
         </w:rPr>
-        <w:t xml:space="preserve">Flutter Developer with 1+ year of professional experience building production-grade cross-platform mobile applications. Developed a full-scale factory management app (app_alfardos) supporting four user roles, real-time Firestore sync, in-app chat, and payment flows — currently deployed at Al-Fardos Metal Factory. Proficient in Flutter/Dart, Bloc state management, and Firebase services. Seeking freelance opportunities to deliver reliable, business-focused mobile solutions.</w:t>
-      </w:r>
-    </w:p>
-    <w:p>
-      <w:pPr>
-        <w:spacing w:after="0" w:before="60"/>
-      </w:pPr>
-      <w:r>
-        <w:t xml:space="preserve"/>
-      </w:r>
-    </w:p>
-    <w:p>
-      <w:pPr>
+        <w:t xml:space="preserve">Flutter developer and Computer Science graduate (2026) with 1+ year of professional experience building production-grade, multi-role business systems for Android, Windows and the web. Built the order management system a metal-processing factory runs on daily, a double-entry accounting system, and a store + repair platform whose permissions live in PostgreSQL through Row Level Security. Owns products end-to-end: database schema, security rules, business logic, tests and Arabic-first (RTL) UI. Open to full-time Flutter roles and freelance projects.</w:t>
+      </w:r>
+    </w:p>
+    <w:p>
+      <w:pPr>
+        <w:keepNext/>
         <w:pBdr>
           <w:bottom w:val="single" w:color="6B3FA0" w:sz="4" w:space="4"/>
         </w:pBdr>
-        <w:spacing w:after="80" w:before="280"/>
+        <w:spacing w:after="80" w:before="240"/>
       </w:pPr>
       <w:r>
         <w:rPr>
@@ -170,10 +186,11 @@
     </w:p>
     <w:p>
       <w:pPr>
+        <w:keepNext/>
         <w:tabs>
-          <w:tab w:val="right" w:pos="9360"/>
+          <w:tab w:val="right" w:pos="10080"/>
         </w:tabs>
-        <w:spacing w:after="40" w:before="160"/>
+        <w:spacing w:after="30" w:before="150"/>
       </w:pPr>
       <w:r>
         <w:rPr>
@@ -181,10 +198,10 @@
           <w:b/>
           <w:bCs/>
           <w:color w:val="1A1A2E"/>
-          <w:sz w:val="22"/>
-          <w:szCs w:val="22"/>
-        </w:rPr>
-        <w:t xml:space="preserve">app_alfardos — Factory Order Management System</w:t>
+          <w:sz w:val="21"/>
+          <w:szCs w:val="21"/>
+        </w:rPr>
+        <w:t xml:space="preserve">Mokoji — Store, Repairs &amp; Back Office</w:t>
       </w:r>
       <w:r>
         <w:rPr>
@@ -195,12 +212,13 @@
           <w:sz w:val="20"/>
           <w:szCs w:val="20"/>
         </w:rPr>
-        <w:t xml:space="preserve">	2024 – Present</w:t>
-      </w:r>
-    </w:p>
-    <w:p>
-      <w:pPr>
-        <w:spacing w:after="60" w:before="20"/>
+        <w:t xml:space="preserve">	2026</w:t>
+      </w:r>
+    </w:p>
+    <w:p>
+      <w:pPr>
+        <w:keepNext/>
+        <w:spacing w:after="50" w:before="10"/>
       </w:pPr>
       <w:r>
         <w:rPr>
@@ -211,99 +229,92 @@
           <w:sz w:val="20"/>
           <w:szCs w:val="20"/>
         </w:rPr>
-        <w:t xml:space="preserve">Flutter • Dart • Bloc • Firebase Firestore • Firebase Auth • Firebase Storage</w:t>
-      </w:r>
-    </w:p>
-    <w:p>
-      <w:pPr>
-        <w:pStyle w:val="ListParagraph"/>
-        <w:numPr>
-          <w:ilvl w:val="0"/>
-          <w:numId w:val="2"/>
-        </w:numPr>
-        <w:spacing w:after="40" w:before="40"/>
-      </w:pPr>
-      <w:r>
-        <w:rPr>
-          <w:rFonts w:ascii="Arial" w:cs="Arial" w:eastAsia="Arial" w:hAnsi="Arial"/>
-          <w:color w:val="555555"/>
-          <w:sz w:val="20"/>
-          <w:szCs w:val="20"/>
-        </w:rPr>
-        <w:t xml:space="preserve">Full production app for Al-Fardos Metal Factory managing the complete order lifecycle from client request to floor delivery</w:t>
-      </w:r>
-    </w:p>
-    <w:p>
-      <w:pPr>
-        <w:pStyle w:val="ListParagraph"/>
-        <w:numPr>
-          <w:ilvl w:val="0"/>
-          <w:numId w:val="2"/>
-        </w:numPr>
-        <w:spacing w:after="40" w:before="40"/>
-      </w:pPr>
-      <w:r>
-        <w:rPr>
-          <w:rFonts w:ascii="Arial" w:cs="Arial" w:eastAsia="Arial" w:hAnsi="Arial"/>
-          <w:color w:val="555555"/>
-          <w:sz w:val="20"/>
-          <w:szCs w:val="20"/>
-        </w:rPr>
-        <w:t xml:space="preserve">4 user roles: Client, Engineer, Admin/Accounting, Floor Worker — each with a dedicated dashboard and permissions</w:t>
-      </w:r>
-    </w:p>
-    <w:p>
-      <w:pPr>
-        <w:pStyle w:val="ListParagraph"/>
-        <w:numPr>
-          <w:ilvl w:val="0"/>
-          <w:numId w:val="2"/>
-        </w:numPr>
-        <w:spacing w:after="40" w:before="40"/>
-      </w:pPr>
-      <w:r>
-        <w:rPr>
-          <w:rFonts w:ascii="Arial" w:cs="Arial" w:eastAsia="Arial" w:hAnsi="Arial"/>
-          <w:color w:val="555555"/>
-          <w:sz w:val="20"/>
-          <w:szCs w:val="20"/>
-        </w:rPr>
-        <w:t xml:space="preserve">Features: real-time order tracking, in-app chat, file/image uploads, payment flows, push notifications</w:t>
-      </w:r>
-    </w:p>
-    <w:p>
-      <w:pPr>
-        <w:pStyle w:val="ListParagraph"/>
-        <w:numPr>
-          <w:ilvl w:val="0"/>
-          <w:numId w:val="2"/>
-        </w:numPr>
-        <w:spacing w:after="40" w:before="40"/>
-      </w:pPr>
-      <w:r>
-        <w:rPr>
-          <w:rFonts w:ascii="Arial" w:cs="Arial" w:eastAsia="Arial" w:hAnsi="Arial"/>
-          <w:color w:val="555555"/>
-          <w:sz w:val="20"/>
-          <w:szCs w:val="20"/>
-        </w:rPr>
-        <w:t xml:space="preserve">Tech: Flutter/Dart, Bloc state management, Firebase Firestore, Auth, Storage, Cloud Messaging</w:t>
-      </w:r>
-    </w:p>
-    <w:p>
-      <w:pPr>
-        <w:spacing w:after="0" w:before="80"/>
-      </w:pPr>
-      <w:r>
-        <w:t xml:space="preserve"/>
-      </w:r>
-    </w:p>
-    <w:p>
-      <w:pPr>
+        <w:t xml:space="preserve">Flutter • Riverpod 3 • go_router • Freezed • Supabase • PostgreSQL • FCM • Next.js</w:t>
+      </w:r>
+    </w:p>
+    <w:p>
+      <w:pPr>
+        <w:pStyle w:val="ListParagraph"/>
+        <w:numPr>
+          <w:ilvl w:val="0"/>
+          <w:numId w:val="2"/>
+        </w:numPr>
+        <w:spacing w:after="30" w:before="30"/>
+      </w:pPr>
+      <w:r>
+        <w:rPr>
+          <w:rFonts w:ascii="Arial" w:cs="Arial" w:eastAsia="Arial" w:hAnsi="Arial"/>
+          <w:color w:val="555555"/>
+          <w:sz w:val="20"/>
+          <w:szCs w:val="20"/>
+        </w:rPr>
+        <w:t xml:space="preserve">One app, three roles (Customer, Technician, Admin): store, cart and checkout, live repair queue, warehouse, cashbox, walk-in sales and reports</w:t>
+      </w:r>
+    </w:p>
+    <w:p>
+      <w:pPr>
+        <w:pStyle w:val="ListParagraph"/>
+        <w:numPr>
+          <w:ilvl w:val="0"/>
+          <w:numId w:val="2"/>
+        </w:numPr>
+        <w:spacing w:after="30" w:before="30"/>
+      </w:pPr>
+      <w:r>
+        <w:rPr>
+          <w:rFonts w:ascii="Arial" w:cs="Arial" w:eastAsia="Arial" w:hAnsi="Arial"/>
+          <w:color w:val="555555"/>
+          <w:sz w:val="20"/>
+          <w:szCs w:val="20"/>
+        </w:rPr>
+        <w:t xml:space="preserve">All permissions enforced in PostgreSQL via Row Level Security; sensitive operations run only through atomic SECURITY DEFINER RPC functions</w:t>
+      </w:r>
+    </w:p>
+    <w:p>
+      <w:pPr>
+        <w:pStyle w:val="ListParagraph"/>
+        <w:numPr>
+          <w:ilvl w:val="0"/>
+          <w:numId w:val="2"/>
+        </w:numPr>
+        <w:spacing w:after="30" w:before="30"/>
+      </w:pPr>
+      <w:r>
+        <w:rPr>
+          <w:rFonts w:ascii="Arial" w:cs="Arial" w:eastAsia="Arial" w:hAnsi="Arial"/>
+          <w:color w:val="555555"/>
+          <w:sz w:val="20"/>
+          <w:szCs w:val="20"/>
+        </w:rPr>
+        <w:t xml:space="preserve">Append-only ledgers for cash and stock, price snapshots on every sale, private photos via signed URLs; wallet, InstaPay and refunds</w:t>
+      </w:r>
+    </w:p>
+    <w:p>
+      <w:pPr>
+        <w:pStyle w:val="ListParagraph"/>
+        <w:numPr>
+          <w:ilvl w:val="0"/>
+          <w:numId w:val="2"/>
+        </w:numPr>
+        <w:spacing w:after="30" w:before="30"/>
+      </w:pPr>
+      <w:r>
+        <w:rPr>
+          <w:rFonts w:ascii="Arial" w:cs="Arial" w:eastAsia="Arial" w:hAnsi="Arial"/>
+          <w:color w:val="555555"/>
+          <w:sz w:val="20"/>
+          <w:szCs w:val="20"/>
+        </w:rPr>
+        <w:t xml:space="preserve">46 tables, 55 RPC functions, 74 migrations, ~31k lines of Dart; companion Next.js website live on Cloudflare Workers</w:t>
+      </w:r>
+    </w:p>
+    <w:p>
+      <w:pPr>
+        <w:keepNext/>
         <w:tabs>
-          <w:tab w:val="right" w:pos="9360"/>
+          <w:tab w:val="right" w:pos="10080"/>
         </w:tabs>
-        <w:spacing w:after="40" w:before="160"/>
+        <w:spacing w:after="30" w:before="150"/>
       </w:pPr>
       <w:r>
         <w:rPr>
@@ -311,10 +322,10 @@
           <w:b/>
           <w:bCs/>
           <w:color w:val="1A1A2E"/>
-          <w:sz w:val="22"/>
-          <w:szCs w:val="22"/>
-        </w:rPr>
-        <w:t xml:space="preserve">BMI Calculator App</w:t>
+          <w:sz w:val="21"/>
+          <w:szCs w:val="21"/>
+        </w:rPr>
+        <w:t xml:space="preserve">Al-Fardos Factory — Order Management System</w:t>
       </w:r>
       <w:r>
         <w:rPr>
@@ -325,12 +336,13 @@
           <w:sz w:val="20"/>
           <w:szCs w:val="20"/>
         </w:rPr>
-        <w:t xml:space="preserve">	2024</w:t>
-      </w:r>
-    </w:p>
-    <w:p>
-      <w:pPr>
-        <w:spacing w:after="60" w:before="20"/>
+        <w:t xml:space="preserve">	2024 – Present</w:t>
+      </w:r>
+    </w:p>
+    <w:p>
+      <w:pPr>
+        <w:keepNext/>
+        <w:spacing w:after="50" w:before="10"/>
       </w:pPr>
       <w:r>
         <w:rPr>
@@ -341,61 +353,270 @@
           <w:sz w:val="20"/>
           <w:szCs w:val="20"/>
         </w:rPr>
-        <w:t xml:space="preserve">Flutter • Dart • Clean UI</w:t>
-      </w:r>
-    </w:p>
-    <w:p>
-      <w:pPr>
-        <w:pStyle w:val="ListParagraph"/>
-        <w:numPr>
-          <w:ilvl w:val="0"/>
-          <w:numId w:val="2"/>
-        </w:numPr>
-        <w:spacing w:after="40" w:before="40"/>
-      </w:pPr>
-      <w:r>
-        <w:rPr>
-          <w:rFonts w:ascii="Arial" w:cs="Arial" w:eastAsia="Arial" w:hAnsi="Arial"/>
-          <w:color w:val="555555"/>
-          <w:sz w:val="20"/>
-          <w:szCs w:val="20"/>
-        </w:rPr>
-        <w:t xml:space="preserve">Clean, responsive BMI calculator with dynamic result display and health range indicators</w:t>
-      </w:r>
-    </w:p>
-    <w:p>
-      <w:pPr>
-        <w:pStyle w:val="ListParagraph"/>
-        <w:numPr>
-          <w:ilvl w:val="0"/>
-          <w:numId w:val="2"/>
-        </w:numPr>
-        <w:spacing w:after="40" w:before="40"/>
-      </w:pPr>
-      <w:r>
-        <w:rPr>
-          <w:rFonts w:ascii="Arial" w:cs="Arial" w:eastAsia="Arial" w:hAnsi="Arial"/>
-          <w:color w:val="555555"/>
-          <w:sz w:val="20"/>
-          <w:szCs w:val="20"/>
-        </w:rPr>
-        <w:t xml:space="preserve">Available on GitHub portfolio as a demonstration of UI/UX best practices</w:t>
-      </w:r>
-    </w:p>
-    <w:p>
-      <w:pPr>
-        <w:spacing w:after="0" w:before="60"/>
-      </w:pPr>
-      <w:r>
-        <w:t xml:space="preserve"/>
-      </w:r>
-    </w:p>
-    <w:p>
-      <w:pPr>
+        <w:t xml:space="preserve">Flutter • Bloc / Cubit • Firestore • Firebase Auth • Cloud Messaging • Cloudinary</w:t>
+      </w:r>
+    </w:p>
+    <w:p>
+      <w:pPr>
+        <w:pStyle w:val="ListParagraph"/>
+        <w:numPr>
+          <w:ilvl w:val="0"/>
+          <w:numId w:val="2"/>
+        </w:numPr>
+        <w:spacing w:after="30" w:before="30"/>
+      </w:pPr>
+      <w:r>
+        <w:rPr>
+          <w:rFonts w:ascii="Arial" w:cs="Arial" w:eastAsia="Arial" w:hAnsi="Arial"/>
+          <w:color w:val="555555"/>
+          <w:sz w:val="20"/>
+          <w:szCs w:val="20"/>
+        </w:rPr>
+        <w:t xml:space="preserve">Production app in daily use at Al-Fardos Metal Factory, covering the full order lifecycle from client request to floor delivery</w:t>
+      </w:r>
+    </w:p>
+    <w:p>
+      <w:pPr>
+        <w:pStyle w:val="ListParagraph"/>
+        <w:numPr>
+          <w:ilvl w:val="0"/>
+          <w:numId w:val="2"/>
+        </w:numPr>
+        <w:spacing w:after="30" w:before="30"/>
+      </w:pPr>
+      <w:r>
+        <w:rPr>
+          <w:rFonts w:ascii="Arial" w:cs="Arial" w:eastAsia="Arial" w:hAnsi="Arial"/>
+          <w:color w:val="555555"/>
+          <w:sz w:val="20"/>
+          <w:szCs w:val="20"/>
+        </w:rPr>
+        <w:t xml:space="preserve">4 roles in one app (Client, Engineer, Office, Floor Worker) with real-time tracking, in-app chat per order, drawing uploads and deposit flow</w:t>
+      </w:r>
+    </w:p>
+    <w:p>
+      <w:pPr>
+        <w:keepNext/>
+        <w:tabs>
+          <w:tab w:val="right" w:pos="10080"/>
+        </w:tabs>
+        <w:spacing w:after="30" w:before="150"/>
+      </w:pPr>
+      <w:r>
+        <w:rPr>
+          <w:rFonts w:ascii="Arial" w:cs="Arial" w:eastAsia="Arial" w:hAnsi="Arial"/>
+          <w:b/>
+          <w:bCs/>
+          <w:color w:val="1A1A2E"/>
+          <w:sz w:val="21"/>
+          <w:szCs w:val="21"/>
+        </w:rPr>
+        <w:t xml:space="preserve">Al-Fardos Management — Accounting &amp; ERP</w:t>
+      </w:r>
+      <w:r>
+        <w:rPr>
+          <w:rFonts w:ascii="Arial" w:cs="Arial" w:eastAsia="Arial" w:hAnsi="Arial"/>
+          <w:i/>
+          <w:iCs/>
+          <w:color w:val="555555"/>
+          <w:sz w:val="20"/>
+          <w:szCs w:val="20"/>
+        </w:rPr>
+        <w:t xml:space="preserve">	2026</w:t>
+      </w:r>
+    </w:p>
+    <w:p>
+      <w:pPr>
+        <w:keepNext/>
+        <w:spacing w:after="50" w:before="10"/>
+      </w:pPr>
+      <w:r>
+        <w:rPr>
+          <w:rFonts w:ascii="Arial" w:cs="Arial" w:eastAsia="Arial" w:hAnsi="Arial"/>
+          <w:i/>
+          <w:iCs/>
+          <w:color w:val="555555"/>
+          <w:sz w:val="20"/>
+          <w:szCs w:val="20"/>
+        </w:rPr>
+        <w:t xml:space="preserve">Flutter • Riverpod • go_router • Firestore • App Check • Crashlytics • Windows &amp; Android</w:t>
+      </w:r>
+    </w:p>
+    <w:p>
+      <w:pPr>
+        <w:pStyle w:val="ListParagraph"/>
+        <w:numPr>
+          <w:ilvl w:val="0"/>
+          <w:numId w:val="2"/>
+        </w:numPr>
+        <w:spacing w:after="30" w:before="30"/>
+      </w:pPr>
+      <w:r>
+        <w:rPr>
+          <w:rFonts w:ascii="Arial" w:cs="Arial" w:eastAsia="Arial" w:hAnsi="Arial"/>
+          <w:color w:val="555555"/>
+          <w:sz w:val="20"/>
+          <w:szCs w:val="20"/>
+        </w:rPr>
+        <w:t xml:space="preserve">Arabic accounting system: sales and purchase invoices, customers, suppliers, cashboxes, expenses, stock, reports, PDF and Excel export</w:t>
+      </w:r>
+    </w:p>
+    <w:p>
+      <w:pPr>
+        <w:pStyle w:val="ListParagraph"/>
+        <w:numPr>
+          <w:ilvl w:val="0"/>
+          <w:numId w:val="2"/>
+        </w:numPr>
+        <w:spacing w:after="30" w:before="30"/>
+      </w:pPr>
+      <w:r>
+        <w:rPr>
+          <w:rFonts w:ascii="Arial" w:cs="Arial" w:eastAsia="Arial" w:hAnsi="Arial"/>
+          <w:color w:val="555555"/>
+          <w:sz w:val="20"/>
+          <w:szCs w:val="20"/>
+        </w:rPr>
+        <w:t xml:space="preserve">Every operation is one balanced double-entry posting written in a single atomic Firestore transaction; idempotent, integer money units</w:t>
+      </w:r>
+    </w:p>
+    <w:p>
+      <w:pPr>
+        <w:pStyle w:val="ListParagraph"/>
+        <w:numPr>
+          <w:ilvl w:val="0"/>
+          <w:numId w:val="2"/>
+        </w:numPr>
+        <w:spacing w:after="30" w:before="30"/>
+      </w:pPr>
+      <w:r>
+        <w:rPr>
+          <w:rFonts w:ascii="Arial" w:cs="Arial" w:eastAsia="Arial" w:hAnsi="Arial"/>
+          <w:color w:val="555555"/>
+          <w:sz w:val="20"/>
+          <w:szCs w:val="20"/>
+        </w:rPr>
+        <w:t xml:space="preserve">Security rules forbid deletes and unbalanced writes (emulator-tested); pure-Dart accounting core fully unit-tested; custom roles and audit log</w:t>
+      </w:r>
+    </w:p>
+    <w:p>
+      <w:pPr>
+        <w:keepNext/>
+        <w:tabs>
+          <w:tab w:val="right" w:pos="10080"/>
+        </w:tabs>
+        <w:spacing w:after="30" w:before="150"/>
+      </w:pPr>
+      <w:r>
+        <w:rPr>
+          <w:rFonts w:ascii="Arial" w:cs="Arial" w:eastAsia="Arial" w:hAnsi="Arial"/>
+          <w:b/>
+          <w:bCs/>
+          <w:color w:val="1A1A2E"/>
+          <w:sz w:val="21"/>
+          <w:szCs w:val="21"/>
+        </w:rPr>
+        <w:t xml:space="preserve">Length Factory — Order &amp; Inventory System</w:t>
+      </w:r>
+      <w:r>
+        <w:rPr>
+          <w:rFonts w:ascii="Arial" w:cs="Arial" w:eastAsia="Arial" w:hAnsi="Arial"/>
+          <w:i/>
+          <w:iCs/>
+          <w:color w:val="555555"/>
+          <w:sz w:val="20"/>
+          <w:szCs w:val="20"/>
+        </w:rPr>
+        <w:t xml:space="preserve">	2026</w:t>
+      </w:r>
+    </w:p>
+    <w:p>
+      <w:pPr>
+        <w:keepNext/>
+        <w:spacing w:after="50" w:before="10"/>
+      </w:pPr>
+      <w:r>
+        <w:rPr>
+          <w:rFonts w:ascii="Arial" w:cs="Arial" w:eastAsia="Arial" w:hAnsi="Arial"/>
+          <w:i/>
+          <w:iCs/>
+          <w:color w:val="555555"/>
+          <w:sz w:val="20"/>
+          <w:szCs w:val="20"/>
+        </w:rPr>
+        <w:t xml:space="preserve">Flutter • Cubit • get_it • dartz • go_router • Firestore • Windows Desktop</w:t>
+      </w:r>
+    </w:p>
+    <w:p>
+      <w:pPr>
+        <w:pStyle w:val="ListParagraph"/>
+        <w:numPr>
+          <w:ilvl w:val="0"/>
+          <w:numId w:val="2"/>
+        </w:numPr>
+        <w:spacing w:after="30" w:before="30"/>
+      </w:pPr>
+      <w:r>
+        <w:rPr>
+          <w:rFonts w:ascii="Arial" w:cs="Arial" w:eastAsia="Arial" w:hAnsi="Arial"/>
+          <w:color w:val="555555"/>
+          <w:sz w:val="20"/>
+          <w:szCs w:val="20"/>
+        </w:rPr>
+        <w:t xml:space="preserve">Clean Architecture (data / domain / presentation) with Either-based error handling; 3 roles with atomic checkout and payment transactions</w:t>
+      </w:r>
+    </w:p>
+    <w:p>
+      <w:pPr>
+        <w:pStyle w:val="ListParagraph"/>
+        <w:numPr>
+          <w:ilvl w:val="0"/>
+          <w:numId w:val="2"/>
+        </w:numPr>
+        <w:spacing w:after="30" w:before="30"/>
+      </w:pPr>
+      <w:r>
+        <w:rPr>
+          <w:rFonts w:ascii="Arial" w:cs="Arial" w:eastAsia="Arial" w:hAnsi="Arial"/>
+          <w:color w:val="555555"/>
+          <w:sz w:val="20"/>
+          <w:szCs w:val="20"/>
+        </w:rPr>
+        <w:t xml:space="preserve">Security rules mirror UI permissions (workers never see prices); PDF invoices, live charts, one codebase for Android and Windows</w:t>
+      </w:r>
+    </w:p>
+    <w:p>
+      <w:pPr>
+        <w:spacing w:after="40" w:before="120"/>
+      </w:pPr>
+      <w:r>
+        <w:rPr>
+          <w:rFonts w:ascii="Arial" w:cs="Arial" w:eastAsia="Arial" w:hAnsi="Arial"/>
+          <w:b/>
+          <w:bCs/>
+          <w:color w:val="1A1A2E"/>
+          <w:sz w:val="20"/>
+          <w:szCs w:val="20"/>
+        </w:rPr>
+        <w:t xml:space="preserve">Also: </w:t>
+      </w:r>
+      <w:r>
+        <w:rPr>
+          <w:rFonts w:ascii="Arial" w:cs="Arial" w:eastAsia="Arial" w:hAnsi="Arial"/>
+          <w:color w:val="555555"/>
+          <w:sz w:val="20"/>
+          <w:szCs w:val="20"/>
+        </w:rPr>
+        <w:t xml:space="preserve">Eyan (doctor booking, Arabic/English)  •  Smart Institute (student &amp; doctor portal)  •  Book Store  •  Taskati</w:t>
+      </w:r>
+    </w:p>
+    <w:p>
+      <w:pPr>
+        <w:keepNext/>
         <w:pBdr>
           <w:bottom w:val="single" w:color="6B3FA0" w:sz="4" w:space="4"/>
         </w:pBdr>
-        <w:spacing w:after="80" w:before="280"/>
+        <w:spacing w:after="80" w:before="240"/>
       </w:pPr>
       <w:r>
         <w:rPr>
@@ -411,10 +632,11 @@
     </w:p>
     <w:p>
       <w:pPr>
+        <w:keepNext/>
         <w:tabs>
-          <w:tab w:val="right" w:pos="9360"/>
+          <w:tab w:val="right" w:pos="10080"/>
         </w:tabs>
-        <w:spacing w:after="40" w:before="160"/>
+        <w:spacing w:after="30" w:before="150"/>
       </w:pPr>
       <w:r>
         <w:rPr>
@@ -422,8 +644,8 @@
           <w:b/>
           <w:bCs/>
           <w:color w:val="1A1A2E"/>
-          <w:sz w:val="22"/>
-          <w:szCs w:val="22"/>
+          <w:sz w:val="21"/>
+          <w:szCs w:val="21"/>
         </w:rPr>
         <w:t xml:space="preserve">Flutter Developer — Al-Fardos Metal Factory</w:t>
       </w:r>
@@ -441,7 +663,8 @@
     </w:p>
     <w:p>
       <w:pPr>
-        <w:spacing w:after="60" w:before="20"/>
+        <w:keepNext/>
+        <w:spacing w:after="50" w:before="10"/>
       </w:pPr>
       <w:r>
         <w:rPr>
@@ -462,70 +685,63 @@
           <w:ilvl w:val="0"/>
           <w:numId w:val="2"/>
         </w:numPr>
-        <w:spacing w:after="40" w:before="40"/>
-      </w:pPr>
-      <w:r>
-        <w:rPr>
-          <w:rFonts w:ascii="Arial" w:cs="Arial" w:eastAsia="Arial" w:hAnsi="Arial"/>
-          <w:color w:val="555555"/>
-          <w:sz w:val="20"/>
-          <w:szCs w:val="20"/>
-        </w:rPr>
-        <w:t xml:space="preserve">Designed and built app_alfardos from scratch as a production tool used daily by factory staff and clients</w:t>
-      </w:r>
-    </w:p>
-    <w:p>
-      <w:pPr>
-        <w:pStyle w:val="ListParagraph"/>
-        <w:numPr>
-          <w:ilvl w:val="0"/>
-          <w:numId w:val="2"/>
-        </w:numPr>
-        <w:spacing w:after="40" w:before="40"/>
-      </w:pPr>
-      <w:r>
-        <w:rPr>
-          <w:rFonts w:ascii="Arial" w:cs="Arial" w:eastAsia="Arial" w:hAnsi="Arial"/>
-          <w:color w:val="555555"/>
-          <w:sz w:val="20"/>
-          <w:szCs w:val="20"/>
-        </w:rPr>
-        <w:t xml:space="preserve">Maintained and iterated the app based on real user feedback from engineers and floor workers</w:t>
-      </w:r>
-    </w:p>
-    <w:p>
-      <w:pPr>
-        <w:pStyle w:val="ListParagraph"/>
-        <w:numPr>
-          <w:ilvl w:val="0"/>
-          <w:numId w:val="2"/>
-        </w:numPr>
-        <w:spacing w:after="40" w:before="40"/>
-      </w:pPr>
-      <w:r>
-        <w:rPr>
-          <w:rFonts w:ascii="Arial" w:cs="Arial" w:eastAsia="Arial" w:hAnsi="Arial"/>
-          <w:color w:val="555555"/>
-          <w:sz w:val="20"/>
-          <w:szCs w:val="20"/>
-        </w:rPr>
-        <w:t xml:space="preserve">Managed Firebase backend including Firestore schema design, security rules, and storage</w:t>
-      </w:r>
-    </w:p>
-    <w:p>
-      <w:pPr>
-        <w:spacing w:after="0" w:before="80"/>
-      </w:pPr>
-      <w:r>
-        <w:t xml:space="preserve"/>
-      </w:r>
-    </w:p>
-    <w:p>
-      <w:pPr>
+        <w:spacing w:after="30" w:before="30"/>
+      </w:pPr>
+      <w:r>
+        <w:rPr>
+          <w:rFonts w:ascii="Arial" w:cs="Arial" w:eastAsia="Arial" w:hAnsi="Arial"/>
+          <w:color w:val="555555"/>
+          <w:sz w:val="20"/>
+          <w:szCs w:val="20"/>
+        </w:rPr>
+        <w:t xml:space="preserve">Designed and built Al-Fardos Factory from scratch as a production tool used daily by factory staff and clients</w:t>
+      </w:r>
+    </w:p>
+    <w:p>
+      <w:pPr>
+        <w:pStyle w:val="ListParagraph"/>
+        <w:numPr>
+          <w:ilvl w:val="0"/>
+          <w:numId w:val="2"/>
+        </w:numPr>
+        <w:spacing w:after="30" w:before="30"/>
+      </w:pPr>
+      <w:r>
+        <w:rPr>
+          <w:rFonts w:ascii="Arial" w:cs="Arial" w:eastAsia="Arial" w:hAnsi="Arial"/>
+          <w:color w:val="555555"/>
+          <w:sz w:val="20"/>
+          <w:szCs w:val="20"/>
+        </w:rPr>
+        <w:t xml:space="preserve">Built Al-Fardos Management, a double-entry accounting system for Windows and Android, with tested ledger logic and security rules</w:t>
+      </w:r>
+    </w:p>
+    <w:p>
+      <w:pPr>
+        <w:pStyle w:val="ListParagraph"/>
+        <w:numPr>
+          <w:ilvl w:val="0"/>
+          <w:numId w:val="2"/>
+        </w:numPr>
+        <w:spacing w:after="30" w:before="30"/>
+      </w:pPr>
+      <w:r>
+        <w:rPr>
+          <w:rFonts w:ascii="Arial" w:cs="Arial" w:eastAsia="Arial" w:hAnsi="Arial"/>
+          <w:color w:val="555555"/>
+          <w:sz w:val="20"/>
+          <w:szCs w:val="20"/>
+        </w:rPr>
+        <w:t xml:space="preserve">Owned the Firebase backend: Firestore schema design, security rules, storage and push notifications</w:t>
+      </w:r>
+    </w:p>
+    <w:p>
+      <w:pPr>
+        <w:keepNext/>
         <w:tabs>
-          <w:tab w:val="right" w:pos="9360"/>
+          <w:tab w:val="right" w:pos="10080"/>
         </w:tabs>
-        <w:spacing w:after="40" w:before="160"/>
+        <w:spacing w:after="30" w:before="150"/>
       </w:pPr>
       <w:r>
         <w:rPr>
@@ -533,8 +749,8 @@
           <w:b/>
           <w:bCs/>
           <w:color w:val="1A1A2E"/>
-          <w:sz w:val="22"/>
-          <w:szCs w:val="22"/>
+          <w:sz w:val="21"/>
+          <w:szCs w:val="21"/>
         </w:rPr>
         <w:t xml:space="preserve">Mobile Development Engineer — EraaSoft</w:t>
       </w:r>
@@ -552,7 +768,8 @@
     </w:p>
     <w:p>
       <w:pPr>
-        <w:spacing w:after="60" w:before="20"/>
+        <w:keepNext/>
+        <w:spacing w:after="50" w:before="10"/>
       </w:pPr>
       <w:r>
         <w:rPr>
@@ -573,7 +790,7 @@
           <w:ilvl w:val="0"/>
           <w:numId w:val="2"/>
         </w:numPr>
-        <w:spacing w:after="40" w:before="40"/>
+        <w:spacing w:after="30" w:before="30"/>
       </w:pPr>
       <w:r>
         <w:rPr>
@@ -592,7 +809,7 @@
           <w:ilvl w:val="0"/>
           <w:numId w:val="2"/>
         </w:numPr>
-        <w:spacing w:after="40" w:before="40"/>
+        <w:spacing w:after="30" w:before="30"/>
       </w:pPr>
       <w:r>
         <w:rPr>
@@ -611,7 +828,7 @@
           <w:ilvl w:val="0"/>
           <w:numId w:val="2"/>
         </w:numPr>
-        <w:spacing w:after="40" w:before="40"/>
+        <w:spacing w:after="30" w:before="30"/>
       </w:pPr>
       <w:r>
         <w:rPr>
@@ -625,18 +842,11 @@
     </w:p>
     <w:p>
       <w:pPr>
-        <w:spacing w:after="0" w:before="60"/>
-      </w:pPr>
-      <w:r>
-        <w:t xml:space="preserve"/>
-      </w:r>
-    </w:p>
-    <w:p>
-      <w:pPr>
+        <w:keepNext/>
         <w:pBdr>
           <w:bottom w:val="single" w:color="6B3FA0" w:sz="4" w:space="4"/>
         </w:pBdr>
-        <w:spacing w:after="80" w:before="280"/>
+        <w:spacing w:after="80" w:before="240"/>
       </w:pPr>
       <w:r>
         <w:rPr>
@@ -652,10 +862,11 @@
     </w:p>
     <w:p>
       <w:pPr>
+        <w:keepNext/>
         <w:tabs>
-          <w:tab w:val="right" w:pos="9360"/>
+          <w:tab w:val="right" w:pos="10080"/>
         </w:tabs>
-        <w:spacing w:after="40" w:before="160"/>
+        <w:spacing w:after="30" w:before="150"/>
       </w:pPr>
       <w:r>
         <w:rPr>
@@ -663,8 +874,8 @@
           <w:b/>
           <w:bCs/>
           <w:color w:val="1A1A2E"/>
-          <w:sz w:val="22"/>
-          <w:szCs w:val="22"/>
+          <w:sz w:val="21"/>
+          <w:szCs w:val="21"/>
         </w:rPr>
         <w:t xml:space="preserve">Bachelor's Degree in Computer Science &amp; Information Systems</w:t>
       </w:r>
@@ -677,12 +888,13 @@
           <w:sz w:val="20"/>
           <w:szCs w:val="20"/>
         </w:rPr>
-        <w:t xml:space="preserve">	Sep 2021 – Expected 2026</w:t>
-      </w:r>
-    </w:p>
-    <w:p>
-      <w:pPr>
-        <w:spacing w:after="60" w:before="20"/>
+        <w:t xml:space="preserve">	Sep 2021 – 2026</w:t>
+      </w:r>
+    </w:p>
+    <w:p>
+      <w:pPr>
+        <w:keepNext/>
+        <w:spacing w:after="50" w:before="10"/>
       </w:pPr>
       <w:r>
         <w:rPr>
@@ -693,17 +905,17 @@
           <w:sz w:val="20"/>
           <w:szCs w:val="20"/>
         </w:rPr>
-        <w:t xml:space="preserve">October University, Faculty of Computer Science — Cairo, Egypt</w:t>
-      </w:r>
-    </w:p>
-    <w:p>
-      <w:pPr>
-        <w:pStyle w:val="ListParagraph"/>
-        <w:numPr>
-          <w:ilvl w:val="0"/>
-          <w:numId w:val="2"/>
-        </w:numPr>
-        <w:spacing w:after="40" w:before="40"/>
+        <w:t xml:space="preserve">October University, Faculty of Computer Science — Cairo, Egypt  •  Graduated</w:t>
+      </w:r>
+    </w:p>
+    <w:p>
+      <w:pPr>
+        <w:pStyle w:val="ListParagraph"/>
+        <w:numPr>
+          <w:ilvl w:val="0"/>
+          <w:numId w:val="2"/>
+        </w:numPr>
+        <w:spacing w:after="30" w:before="30"/>
       </w:pPr>
       <w:r>
         <w:rPr>
@@ -717,18 +929,11 @@
     </w:p>
     <w:p>
       <w:pPr>
-        <w:spacing w:after="0" w:before="60"/>
-      </w:pPr>
-      <w:r>
-        <w:t xml:space="preserve"/>
-      </w:r>
-    </w:p>
-    <w:p>
-      <w:pPr>
+        <w:keepNext/>
         <w:pBdr>
           <w:bottom w:val="single" w:color="6B3FA0" w:sz="4" w:space="4"/>
         </w:pBdr>
-        <w:spacing w:after="80" w:before="280"/>
+        <w:spacing w:after="80" w:before="240"/>
       </w:pPr>
       <w:r>
         <w:rPr>
@@ -744,15 +949,7 @@
     </w:p>
     <w:p>
       <w:pPr>
-        <w:spacing w:after="0" w:before="60"/>
-      </w:pPr>
-      <w:r>
-        <w:t xml:space="preserve"/>
-      </w:r>
-    </w:p>
-    <w:p>
-      <w:pPr>
-        <w:spacing w:after="40" w:before="60"/>
+        <w:spacing w:after="40" w:before="40"/>
       </w:pPr>
       <w:r>
         <w:rPr>
@@ -763,21 +960,21 @@
           <w:sz w:val="20"/>
           <w:szCs w:val="20"/>
         </w:rPr>
-        <w:t xml:space="preserve">Mobile:  </w:t>
-      </w:r>
-      <w:r>
-        <w:rPr>
-          <w:rFonts w:ascii="Arial" w:cs="Arial" w:eastAsia="Arial" w:hAnsi="Arial"/>
-          <w:color w:val="555555"/>
-          <w:sz w:val="20"/>
-          <w:szCs w:val="20"/>
-        </w:rPr>
-        <w:t xml:space="preserve">Flutter, Dart, Bloc State Management, Provider</w:t>
-      </w:r>
-    </w:p>
-    <w:p>
-      <w:pPr>
-        <w:spacing w:after="40" w:before="60"/>
+        <w:t xml:space="preserve">Mobile &amp; Desktop:  </w:t>
+      </w:r>
+      <w:r>
+        <w:rPr>
+          <w:rFonts w:ascii="Arial" w:cs="Arial" w:eastAsia="Arial" w:hAnsi="Arial"/>
+          <w:color w:val="555555"/>
+          <w:sz w:val="20"/>
+          <w:szCs w:val="20"/>
+        </w:rPr>
+        <w:t xml:space="preserve">Flutter, Dart, Material 3, responsive shells, Arabic RTL / i18n, Windows Desktop</w:t>
+      </w:r>
+    </w:p>
+    <w:p>
+      <w:pPr>
+        <w:spacing w:after="40" w:before="40"/>
       </w:pPr>
       <w:r>
         <w:rPr>
@@ -788,21 +985,21 @@
           <w:sz w:val="20"/>
           <w:szCs w:val="20"/>
         </w:rPr>
-        <w:t xml:space="preserve">Backend / Cloud:  </w:t>
-      </w:r>
-      <w:r>
-        <w:rPr>
-          <w:rFonts w:ascii="Arial" w:cs="Arial" w:eastAsia="Arial" w:hAnsi="Arial"/>
-          <w:color w:val="555555"/>
-          <w:sz w:val="20"/>
-          <w:szCs w:val="20"/>
-        </w:rPr>
-        <w:t xml:space="preserve">Firebase Firestore, Firebase Auth, Firebase Storage, Cloud Messaging, RESTful APIs</w:t>
-      </w:r>
-    </w:p>
-    <w:p>
-      <w:pPr>
-        <w:spacing w:after="40" w:before="60"/>
+        <w:t xml:space="preserve">State &amp; Architecture:  </w:t>
+      </w:r>
+      <w:r>
+        <w:rPr>
+          <w:rFonts w:ascii="Arial" w:cs="Arial" w:eastAsia="Arial" w:hAnsi="Arial"/>
+          <w:color w:val="555555"/>
+          <w:sz w:val="20"/>
+          <w:szCs w:val="20"/>
+        </w:rPr>
+        <w:t xml:space="preserve">Bloc / Cubit, Riverpod, Provider, Clean Architecture, Repository pattern, get_it, go_router, Freezed</w:t>
+      </w:r>
+    </w:p>
+    <w:p>
+      <w:pPr>
+        <w:spacing w:after="40" w:before="40"/>
       </w:pPr>
       <w:r>
         <w:rPr>
@@ -813,21 +1010,21 @@
           <w:sz w:val="20"/>
           <w:szCs w:val="20"/>
         </w:rPr>
-        <w:t xml:space="preserve">Tools:  </w:t>
-      </w:r>
-      <w:r>
-        <w:rPr>
-          <w:rFonts w:ascii="Arial" w:cs="Arial" w:eastAsia="Arial" w:hAnsi="Arial"/>
-          <w:color w:val="555555"/>
-          <w:sz w:val="20"/>
-          <w:szCs w:val="20"/>
-        </w:rPr>
-        <w:t xml:space="preserve">Git, GitHub, Android Studio, VS Code, Postman</w:t>
-      </w:r>
-    </w:p>
-    <w:p>
-      <w:pPr>
-        <w:spacing w:after="40" w:before="60"/>
+        <w:t xml:space="preserve">Firebase:  </w:t>
+      </w:r>
+      <w:r>
+        <w:rPr>
+          <w:rFonts w:ascii="Arial" w:cs="Arial" w:eastAsia="Arial" w:hAnsi="Arial"/>
+          <w:color w:val="555555"/>
+          <w:sz w:val="20"/>
+          <w:szCs w:val="20"/>
+        </w:rPr>
+        <w:t xml:space="preserve">Firestore, Auth, Storage, Cloud Messaging, App Check, Crashlytics, Security Rules</w:t>
+      </w:r>
+    </w:p>
+    <w:p>
+      <w:pPr>
+        <w:spacing w:after="40" w:before="40"/>
       </w:pPr>
       <w:r>
         <w:rPr>
@@ -838,32 +1035,75 @@
           <w:sz w:val="20"/>
           <w:szCs w:val="20"/>
         </w:rPr>
-        <w:t xml:space="preserve">Practices:  </w:t>
-      </w:r>
-      <w:r>
-        <w:rPr>
-          <w:rFonts w:ascii="Arial" w:cs="Arial" w:eastAsia="Arial" w:hAnsi="Arial"/>
-          <w:color w:val="555555"/>
-          <w:sz w:val="20"/>
-          <w:szCs w:val="20"/>
-        </w:rPr>
-        <w:t xml:space="preserve">Clean Architecture, Agile/Scrum, UI/UX Design Principles</w:t>
-      </w:r>
-    </w:p>
-    <w:p>
-      <w:pPr>
-        <w:spacing w:after="0" w:before="60"/>
-      </w:pPr>
-      <w:r>
-        <w:t xml:space="preserve"/>
-      </w:r>
-    </w:p>
-    <w:p>
-      <w:pPr>
+        <w:t xml:space="preserve">Supabase &amp; SQL:  </w:t>
+      </w:r>
+      <w:r>
+        <w:rPr>
+          <w:rFonts w:ascii="Arial" w:cs="Arial" w:eastAsia="Arial" w:hAnsi="Arial"/>
+          <w:color w:val="555555"/>
+          <w:sz w:val="20"/>
+          <w:szCs w:val="20"/>
+        </w:rPr>
+        <w:t xml:space="preserve">PostgreSQL, Row Level Security, RPC functions, Edge Functions, Realtime, migrations</w:t>
+      </w:r>
+    </w:p>
+    <w:p>
+      <w:pPr>
+        <w:spacing w:after="40" w:before="40"/>
+      </w:pPr>
+      <w:r>
+        <w:rPr>
+          <w:rFonts w:ascii="Arial" w:cs="Arial" w:eastAsia="Arial" w:hAnsi="Arial"/>
+          <w:b/>
+          <w:bCs/>
+          <w:color w:val="6B3FA0"/>
+          <w:sz w:val="20"/>
+          <w:szCs w:val="20"/>
+        </w:rPr>
+        <w:t xml:space="preserve">Web:  </w:t>
+      </w:r>
+      <w:r>
+        <w:rPr>
+          <w:rFonts w:ascii="Arial" w:cs="Arial" w:eastAsia="Arial" w:hAnsi="Arial"/>
+          <w:color w:val="555555"/>
+          <w:sz w:val="20"/>
+          <w:szCs w:val="20"/>
+        </w:rPr>
+        <w:t xml:space="preserve">Next.js, React, TypeScript, Tailwind CSS, Cloudflare Workers, REST APIs</w:t>
+      </w:r>
+    </w:p>
+    <w:p>
+      <w:pPr>
+        <w:spacing w:after="40" w:before="40"/>
+      </w:pPr>
+      <w:r>
+        <w:rPr>
+          <w:rFonts w:ascii="Arial" w:cs="Arial" w:eastAsia="Arial" w:hAnsi="Arial"/>
+          <w:b/>
+          <w:bCs/>
+          <w:color w:val="6B3FA0"/>
+          <w:sz w:val="20"/>
+          <w:szCs w:val="20"/>
+        </w:rPr>
+        <w:t xml:space="preserve">Quality &amp; Tools:  </w:t>
+      </w:r>
+      <w:r>
+        <w:rPr>
+          <w:rFonts w:ascii="Arial" w:cs="Arial" w:eastAsia="Arial" w:hAnsi="Arial"/>
+          <w:color w:val="555555"/>
+          <w:sz w:val="20"/>
+          <w:szCs w:val="20"/>
+        </w:rPr>
+        <w:t xml:space="preserve">Unit &amp; widget tests, security rules testing, Git, GitHub, Android Studio, VS Code, Postman</w:t>
+      </w:r>
+    </w:p>
+    <w:p>
+      <w:pPr>
+        <w:keepNext/>
         <w:pBdr>
           <w:bottom w:val="single" w:color="6B3FA0" w:sz="4" w:space="4"/>
         </w:pBdr>
-        <w:spacing w:after="80" w:before="280"/>
+        <w:spacing w:after="80" w:before="240"/>
       </w:pPr>
       <w:r>
         <w:rPr>
@@ -879,15 +1119,7 @@
     </w:p>
     <w:p>
       <w:pPr>
-        <w:spacing w:after="0" w:before="60"/>
-      </w:pPr>
-      <w:r>
-        <w:t xml:space="preserve"/>
-      </w:r>
-    </w:p>
-    <w:p>
-      <w:pPr>
-        <w:spacing w:after="40" w:before="60"/>
+        <w:spacing w:after="40" w:before="40"/>
       </w:pPr>
       <w:r>
         <w:rPr>
@@ -912,7 +1144,7 @@
     </w:p>
     <w:p>
       <w:pPr>
-        <w:spacing w:after="40" w:before="60"/>
+        <w:spacing w:after="40" w:before="40"/>
       </w:pPr>
       <w:r>
         <w:rPr>
@@ -937,7 +1169,7 @@
     </w:p>
     <w:p>
       <w:pPr>
-        <w:spacing w:after="40" w:before="60"/>
+        <w:spacing w:after="40" w:before="40"/>
       </w:pPr>
       <w:r>
         <w:rPr>
@@ -957,7 +1189,7 @@
           <w:sz w:val="20"/>
           <w:szCs w:val="20"/>
         </w:rPr>
-        <w:t xml:space="preserve">Upwork (active freelancer), GitHub (open portfolio)</w:t>
+        <w:t xml:space="preserve">Upwork (active freelancer), GitHub (open portfolio), osama-yosef.github.io/osama-yosef-portfolio</w:t>
       </w:r>
     </w:p>
     <w:sectPr>

</xml_diff>

<commit_message>
Fit the CV on a single page
Same content; only the spacing, margins and font sizes were reduced
so the CV fits on one page.

Co-Authored-By: Claude Opus 5.5 <noreply@anthropic.com>
Claude-Session: https://claude.ai/code/session_01CvPfAjhWvduUgH3U9iMkQ7
</commit_message>
<xml_diff>
--- a/assets/docs/Osama_Yosef_CV.docx
+++ b/assets/docs/Osama_Yosef_CV.docx
@@ -4,47 +4,47 @@
   <w:body>
     <w:p>
       <w:pPr>
-        <w:spacing w:after="60" w:before="0"/>
-        <w:jc w:val="center"/>
-      </w:pPr>
-      <w:r>
-        <w:rPr>
-          <w:rFonts w:ascii="Arial" w:cs="Arial" w:eastAsia="Arial" w:hAnsi="Arial"/>
-          <w:b/>
-          <w:bCs/>
-          <w:color w:val="6B3FA0"/>
-          <w:sz w:val="52"/>
-          <w:szCs w:val="52"/>
-        </w:rPr>
-        <w:t xml:space="preserve">OSAMA YOSEF</w:t>
-      </w:r>
-    </w:p>
-    <w:p>
-      <w:pPr>
-        <w:spacing w:after="80" w:before="0"/>
-        <w:jc w:val="center"/>
-      </w:pPr>
-      <w:r>
-        <w:rPr>
-          <w:rFonts w:ascii="Arial" w:cs="Arial" w:eastAsia="Arial" w:hAnsi="Arial"/>
-          <w:color w:val="555555"/>
-          <w:sz w:val="22"/>
-          <w:szCs w:val="22"/>
-        </w:rPr>
-        <w:t xml:space="preserve">Flutter Developer  |  Business Systems for Android, Windows &amp; Web</w:t>
-      </w:r>
-    </w:p>
-    <w:p>
-      <w:pPr>
         <w:spacing w:after="20" w:before="0"/>
         <w:jc w:val="center"/>
       </w:pPr>
       <w:r>
         <w:rPr>
           <w:rFonts w:ascii="Arial" w:cs="Arial" w:eastAsia="Arial" w:hAnsi="Arial"/>
+          <w:b/>
+          <w:bCs/>
+          <w:color w:val="6B3FA0"/>
+          <w:sz w:val="40"/>
+          <w:szCs w:val="40"/>
+        </w:rPr>
+        <w:t xml:space="preserve">OSAMA YOSEF</w:t>
+      </w:r>
+    </w:p>
+    <w:p>
+      <w:pPr>
+        <w:spacing w:after="40" w:before="0"/>
+        <w:jc w:val="center"/>
+      </w:pPr>
+      <w:r>
+        <w:rPr>
+          <w:rFonts w:ascii="Arial" w:cs="Arial" w:eastAsia="Arial" w:hAnsi="Arial"/>
           <w:color w:val="555555"/>
           <w:sz w:val="19"/>
           <w:szCs w:val="19"/>
+        </w:rPr>
+        <w:t xml:space="preserve">Flutter Developer  |  Business Systems for Android, Windows &amp; Web</w:t>
+      </w:r>
+    </w:p>
+    <w:p>
+      <w:pPr>
+        <w:spacing w:after="10" w:before="0"/>
+        <w:jc w:val="center"/>
+      </w:pPr>
+      <w:r>
+        <w:rPr>
+          <w:rFonts w:ascii="Arial" w:cs="Arial" w:eastAsia="Arial" w:hAnsi="Arial"/>
+          <w:color w:val="555555"/>
+          <w:sz w:val="17"/>
+          <w:szCs w:val="17"/>
         </w:rPr>
         <w:t xml:space="preserve">Cairo, Egypt  •  +20 109 652 5584  •  osamayosef038@gmail.com</w:t>
       </w:r>
@@ -59,8 +59,8 @@
           <w:rPr>
             <w:rFonts w:ascii="Arial" w:cs="Arial" w:eastAsia="Arial" w:hAnsi="Arial"/>
             <w:color w:val="6B3FA0"/>
-            <w:sz w:val="19"/>
-            <w:szCs w:val="19"/>
+            <w:sz w:val="17"/>
+            <w:szCs w:val="17"/>
             <w:u w:val="single"/>
           </w:rPr>
           <w:t xml:space="preserve">Portfolio</w:t>
@@ -70,8 +70,8 @@
         <w:rPr>
           <w:rFonts w:ascii="Arial" w:cs="Arial" w:eastAsia="Arial" w:hAnsi="Arial"/>
           <w:color w:val="555555"/>
-          <w:sz w:val="19"/>
-          <w:szCs w:val="19"/>
+          <w:sz w:val="17"/>
+          <w:szCs w:val="17"/>
         </w:rPr>
         <w:t xml:space="preserve">  •  </w:t>
       </w:r>
@@ -80,8 +80,8 @@
           <w:rPr>
             <w:rFonts w:ascii="Arial" w:cs="Arial" w:eastAsia="Arial" w:hAnsi="Arial"/>
             <w:color w:val="6B3FA0"/>
-            <w:sz w:val="19"/>
-            <w:szCs w:val="19"/>
+            <w:sz w:val="17"/>
+            <w:szCs w:val="17"/>
             <w:u w:val="single"/>
           </w:rPr>
           <w:t xml:space="preserve">github.com/osama-Yosef</w:t>
@@ -91,8 +91,8 @@
         <w:rPr>
           <w:rFonts w:ascii="Arial" w:cs="Arial" w:eastAsia="Arial" w:hAnsi="Arial"/>
           <w:color w:val="555555"/>
-          <w:sz w:val="19"/>
-          <w:szCs w:val="19"/>
+          <w:sz w:val="17"/>
+          <w:szCs w:val="17"/>
         </w:rPr>
         <w:t xml:space="preserve">  •  </w:t>
       </w:r>
@@ -101,8 +101,8 @@
           <w:rPr>
             <w:rFonts w:ascii="Arial" w:cs="Arial" w:eastAsia="Arial" w:hAnsi="Arial"/>
             <w:color w:val="6B3FA0"/>
-            <w:sz w:val="19"/>
-            <w:szCs w:val="19"/>
+            <w:sz w:val="17"/>
+            <w:szCs w:val="17"/>
             <w:u w:val="single"/>
           </w:rPr>
           <w:t xml:space="preserve">LinkedIn</w:t>
@@ -112,8 +112,8 @@
         <w:rPr>
           <w:rFonts w:ascii="Arial" w:cs="Arial" w:eastAsia="Arial" w:hAnsi="Arial"/>
           <w:color w:val="555555"/>
-          <w:sz w:val="19"/>
-          <w:szCs w:val="19"/>
+          <w:sz w:val="17"/>
+          <w:szCs w:val="17"/>
         </w:rPr>
         <w:t xml:space="preserve">  •  </w:t>
       </w:r>
@@ -122,8 +122,8 @@
           <w:rPr>
             <w:rFonts w:ascii="Arial" w:cs="Arial" w:eastAsia="Arial" w:hAnsi="Arial"/>
             <w:color w:val="6B3FA0"/>
-            <w:sz w:val="19"/>
-            <w:szCs w:val="19"/>
+            <w:sz w:val="17"/>
+            <w:szCs w:val="17"/>
             <w:u w:val="single"/>
           </w:rPr>
           <w:t xml:space="preserve">Upwork Profile</w:t>
@@ -134,9 +134,9 @@
       <w:pPr>
         <w:keepNext/>
         <w:pBdr>
-          <w:bottom w:val="single" w:color="6B3FA0" w:sz="4" w:space="4"/>
+          <w:bottom w:val="single" w:color="6B3FA0" w:sz="4" w:space="2"/>
         </w:pBdr>
-        <w:spacing w:after="80" w:before="240"/>
+        <w:spacing w:after="36" w:before="70" w:line="240" w:lineRule="auto"/>
       </w:pPr>
       <w:r>
         <w:rPr>
@@ -144,22 +144,22 @@
           <w:b/>
           <w:bCs/>
           <w:color w:val="6B3FA0"/>
-          <w:sz w:val="22"/>
-          <w:szCs w:val="22"/>
+          <w:sz w:val="19"/>
+          <w:szCs w:val="19"/>
         </w:rPr>
         <w:t xml:space="preserve">PROFESSIONAL SUMMARY</w:t>
       </w:r>
     </w:p>
     <w:p>
       <w:pPr>
-        <w:spacing w:after="60" w:before="100"/>
-      </w:pPr>
-      <w:r>
-        <w:rPr>
-          <w:rFonts w:ascii="Arial" w:cs="Arial" w:eastAsia="Arial" w:hAnsi="Arial"/>
-          <w:color w:val="555555"/>
-          <w:sz w:val="20"/>
-          <w:szCs w:val="20"/>
+        <w:spacing w:after="20" w:before="50" w:line="240" w:lineRule="auto"/>
+      </w:pPr>
+      <w:r>
+        <w:rPr>
+          <w:rFonts w:ascii="Arial" w:cs="Arial" w:eastAsia="Arial" w:hAnsi="Arial"/>
+          <w:color w:val="555555"/>
+          <w:sz w:val="17"/>
+          <w:szCs w:val="17"/>
         </w:rPr>
         <w:t xml:space="preserve">Flutter developer and Computer Science graduate (2026) with 1+ year of professional experience building production-grade, multi-role business systems for Android, Windows and the web. Built the order management system a metal-processing factory runs on daily, a double-entry accounting system, and a store + repair platform whose permissions live in PostgreSQL through Row Level Security. Owns products end-to-end: database schema, security rules, business logic, tests and Arabic-first (RTL) UI. Open to full-time Flutter roles and freelance projects.</w:t>
       </w:r>
@@ -168,9 +168,9 @@
       <w:pPr>
         <w:keepNext/>
         <w:pBdr>
-          <w:bottom w:val="single" w:color="6B3FA0" w:sz="4" w:space="4"/>
+          <w:bottom w:val="single" w:color="6B3FA0" w:sz="4" w:space="2"/>
         </w:pBdr>
-        <w:spacing w:after="80" w:before="240"/>
+        <w:spacing w:after="36" w:before="70" w:line="240" w:lineRule="auto"/>
       </w:pPr>
       <w:r>
         <w:rPr>
@@ -178,8 +178,8 @@
           <w:b/>
           <w:bCs/>
           <w:color w:val="6B3FA0"/>
-          <w:sz w:val="22"/>
-          <w:szCs w:val="22"/>
+          <w:sz w:val="19"/>
+          <w:szCs w:val="19"/>
         </w:rPr>
         <w:t xml:space="preserve">KEY PROJECTS</w:t>
       </w:r>
@@ -188,9 +188,9 @@
       <w:pPr>
         <w:keepNext/>
         <w:tabs>
-          <w:tab w:val="right" w:pos="10080"/>
+          <w:tab w:val="right" w:pos="10720"/>
         </w:tabs>
-        <w:spacing w:after="30" w:before="150"/>
+        <w:spacing w:after="6" w:before="50" w:line="240" w:lineRule="auto"/>
       </w:pPr>
       <w:r>
         <w:rPr>
@@ -198,8 +198,8 @@
           <w:b/>
           <w:bCs/>
           <w:color w:val="1A1A2E"/>
-          <w:sz w:val="21"/>
-          <w:szCs w:val="21"/>
+          <w:sz w:val="18"/>
+          <w:szCs w:val="18"/>
         </w:rPr>
         <w:t xml:space="preserve">Mokoji — Store, Repairs &amp; Back Office</w:t>
       </w:r>
@@ -209,8 +209,8 @@
           <w:i/>
           <w:iCs/>
           <w:color w:val="555555"/>
-          <w:sz w:val="20"/>
-          <w:szCs w:val="20"/>
+          <w:sz w:val="17"/>
+          <w:szCs w:val="17"/>
         </w:rPr>
         <w:t xml:space="preserve">	2026</w:t>
       </w:r>
@@ -218,7 +218,7 @@
     <w:p>
       <w:pPr>
         <w:keepNext/>
-        <w:spacing w:after="50" w:before="10"/>
+        <w:spacing w:after="20" w:before="0" w:line="240" w:lineRule="auto"/>
       </w:pPr>
       <w:r>
         <w:rPr>
@@ -226,8 +226,8 @@
           <w:i/>
           <w:iCs/>
           <w:color w:val="555555"/>
-          <w:sz w:val="20"/>
-          <w:szCs w:val="20"/>
+          <w:sz w:val="17"/>
+          <w:szCs w:val="17"/>
         </w:rPr>
         <w:t xml:space="preserve">Flutter • Riverpod 3 • go_router • Freezed • Supabase • PostgreSQL • FCM • Next.js</w:t>
       </w:r>
@@ -239,14 +239,14 @@
           <w:ilvl w:val="0"/>
           <w:numId w:val="2"/>
         </w:numPr>
-        <w:spacing w:after="30" w:before="30"/>
-      </w:pPr>
-      <w:r>
-        <w:rPr>
-          <w:rFonts w:ascii="Arial" w:cs="Arial" w:eastAsia="Arial" w:hAnsi="Arial"/>
-          <w:color w:val="555555"/>
-          <w:sz w:val="20"/>
-          <w:szCs w:val="20"/>
+        <w:spacing w:after="4" w:before="4" w:line="240" w:lineRule="auto"/>
+      </w:pPr>
+      <w:r>
+        <w:rPr>
+          <w:rFonts w:ascii="Arial" w:cs="Arial" w:eastAsia="Arial" w:hAnsi="Arial"/>
+          <w:color w:val="555555"/>
+          <w:sz w:val="17"/>
+          <w:szCs w:val="17"/>
         </w:rPr>
         <w:t xml:space="preserve">One app, three roles (Customer, Technician, Admin): store, cart and checkout, live repair queue, warehouse, cashbox, walk-in sales and reports</w:t>
       </w:r>
@@ -258,14 +258,14 @@
           <w:ilvl w:val="0"/>
           <w:numId w:val="2"/>
         </w:numPr>
-        <w:spacing w:after="30" w:before="30"/>
-      </w:pPr>
-      <w:r>
-        <w:rPr>
-          <w:rFonts w:ascii="Arial" w:cs="Arial" w:eastAsia="Arial" w:hAnsi="Arial"/>
-          <w:color w:val="555555"/>
-          <w:sz w:val="20"/>
-          <w:szCs w:val="20"/>
+        <w:spacing w:after="4" w:before="4" w:line="240" w:lineRule="auto"/>
+      </w:pPr>
+      <w:r>
+        <w:rPr>
+          <w:rFonts w:ascii="Arial" w:cs="Arial" w:eastAsia="Arial" w:hAnsi="Arial"/>
+          <w:color w:val="555555"/>
+          <w:sz w:val="17"/>
+          <w:szCs w:val="17"/>
         </w:rPr>
         <w:t xml:space="preserve">All permissions enforced in PostgreSQL via Row Level Security; sensitive operations run only through atomic SECURITY DEFINER RPC functions</w:t>
       </w:r>
@@ -277,14 +277,14 @@
           <w:ilvl w:val="0"/>
           <w:numId w:val="2"/>
         </w:numPr>
-        <w:spacing w:after="30" w:before="30"/>
-      </w:pPr>
-      <w:r>
-        <w:rPr>
-          <w:rFonts w:ascii="Arial" w:cs="Arial" w:eastAsia="Arial" w:hAnsi="Arial"/>
-          <w:color w:val="555555"/>
-          <w:sz w:val="20"/>
-          <w:szCs w:val="20"/>
+        <w:spacing w:after="4" w:before="4" w:line="240" w:lineRule="auto"/>
+      </w:pPr>
+      <w:r>
+        <w:rPr>
+          <w:rFonts w:ascii="Arial" w:cs="Arial" w:eastAsia="Arial" w:hAnsi="Arial"/>
+          <w:color w:val="555555"/>
+          <w:sz w:val="17"/>
+          <w:szCs w:val="17"/>
         </w:rPr>
         <w:t xml:space="preserve">Append-only ledgers for cash and stock, price snapshots on every sale, private photos via signed URLs; wallet, InstaPay and refunds</w:t>
       </w:r>
@@ -296,14 +296,14 @@
           <w:ilvl w:val="0"/>
           <w:numId w:val="2"/>
         </w:numPr>
-        <w:spacing w:after="30" w:before="30"/>
-      </w:pPr>
-      <w:r>
-        <w:rPr>
-          <w:rFonts w:ascii="Arial" w:cs="Arial" w:eastAsia="Arial" w:hAnsi="Arial"/>
-          <w:color w:val="555555"/>
-          <w:sz w:val="20"/>
-          <w:szCs w:val="20"/>
+        <w:spacing w:after="4" w:before="4" w:line="240" w:lineRule="auto"/>
+      </w:pPr>
+      <w:r>
+        <w:rPr>
+          <w:rFonts w:ascii="Arial" w:cs="Arial" w:eastAsia="Arial" w:hAnsi="Arial"/>
+          <w:color w:val="555555"/>
+          <w:sz w:val="17"/>
+          <w:szCs w:val="17"/>
         </w:rPr>
         <w:t xml:space="preserve">46 tables, 55 RPC functions, 74 migrations, ~31k lines of Dart; companion Next.js website live on Cloudflare Workers</w:t>
       </w:r>
@@ -312,9 +312,9 @@
       <w:pPr>
         <w:keepNext/>
         <w:tabs>
-          <w:tab w:val="right" w:pos="10080"/>
+          <w:tab w:val="right" w:pos="10720"/>
         </w:tabs>
-        <w:spacing w:after="30" w:before="150"/>
+        <w:spacing w:after="6" w:before="50" w:line="240" w:lineRule="auto"/>
       </w:pPr>
       <w:r>
         <w:rPr>
@@ -322,8 +322,8 @@
           <w:b/>
           <w:bCs/>
           <w:color w:val="1A1A2E"/>
-          <w:sz w:val="21"/>
-          <w:szCs w:val="21"/>
+          <w:sz w:val="18"/>
+          <w:szCs w:val="18"/>
         </w:rPr>
         <w:t xml:space="preserve">Al-Fardos Factory — Order Management System</w:t>
       </w:r>
@@ -333,8 +333,8 @@
           <w:i/>
           <w:iCs/>
           <w:color w:val="555555"/>
-          <w:sz w:val="20"/>
-          <w:szCs w:val="20"/>
+          <w:sz w:val="17"/>
+          <w:szCs w:val="17"/>
         </w:rPr>
         <w:t xml:space="preserve">	2024 – Present</w:t>
       </w:r>
@@ -342,7 +342,7 @@
     <w:p>
       <w:pPr>
         <w:keepNext/>
-        <w:spacing w:after="50" w:before="10"/>
+        <w:spacing w:after="20" w:before="0" w:line="240" w:lineRule="auto"/>
       </w:pPr>
       <w:r>
         <w:rPr>
@@ -350,8 +350,8 @@
           <w:i/>
           <w:iCs/>
           <w:color w:val="555555"/>
-          <w:sz w:val="20"/>
-          <w:szCs w:val="20"/>
+          <w:sz w:val="17"/>
+          <w:szCs w:val="17"/>
         </w:rPr>
         <w:t xml:space="preserve">Flutter • Bloc / Cubit • Firestore • Firebase Auth • Cloud Messaging • Cloudinary</w:t>
       </w:r>
@@ -363,14 +363,14 @@
           <w:ilvl w:val="0"/>
           <w:numId w:val="2"/>
         </w:numPr>
-        <w:spacing w:after="30" w:before="30"/>
-      </w:pPr>
-      <w:r>
-        <w:rPr>
-          <w:rFonts w:ascii="Arial" w:cs="Arial" w:eastAsia="Arial" w:hAnsi="Arial"/>
-          <w:color w:val="555555"/>
-          <w:sz w:val="20"/>
-          <w:szCs w:val="20"/>
+        <w:spacing w:after="4" w:before="4" w:line="240" w:lineRule="auto"/>
+      </w:pPr>
+      <w:r>
+        <w:rPr>
+          <w:rFonts w:ascii="Arial" w:cs="Arial" w:eastAsia="Arial" w:hAnsi="Arial"/>
+          <w:color w:val="555555"/>
+          <w:sz w:val="17"/>
+          <w:szCs w:val="17"/>
         </w:rPr>
         <w:t xml:space="preserve">Production app in daily use at Al-Fardos Metal Factory, covering the full order lifecycle from client request to floor delivery</w:t>
       </w:r>
@@ -382,14 +382,14 @@
           <w:ilvl w:val="0"/>
           <w:numId w:val="2"/>
         </w:numPr>
-        <w:spacing w:after="30" w:before="30"/>
-      </w:pPr>
-      <w:r>
-        <w:rPr>
-          <w:rFonts w:ascii="Arial" w:cs="Arial" w:eastAsia="Arial" w:hAnsi="Arial"/>
-          <w:color w:val="555555"/>
-          <w:sz w:val="20"/>
-          <w:szCs w:val="20"/>
+        <w:spacing w:after="4" w:before="4" w:line="240" w:lineRule="auto"/>
+      </w:pPr>
+      <w:r>
+        <w:rPr>
+          <w:rFonts w:ascii="Arial" w:cs="Arial" w:eastAsia="Arial" w:hAnsi="Arial"/>
+          <w:color w:val="555555"/>
+          <w:sz w:val="17"/>
+          <w:szCs w:val="17"/>
         </w:rPr>
         <w:t xml:space="preserve">4 roles in one app (Client, Engineer, Office, Floor Worker) with real-time tracking, in-app chat per order, drawing uploads and deposit flow</w:t>
       </w:r>
@@ -398,9 +398,9 @@
       <w:pPr>
         <w:keepNext/>
         <w:tabs>
-          <w:tab w:val="right" w:pos="10080"/>
+          <w:tab w:val="right" w:pos="10720"/>
         </w:tabs>
-        <w:spacing w:after="30" w:before="150"/>
+        <w:spacing w:after="6" w:before="50" w:line="240" w:lineRule="auto"/>
       </w:pPr>
       <w:r>
         <w:rPr>
@@ -408,8 +408,8 @@
           <w:b/>
           <w:bCs/>
           <w:color w:val="1A1A2E"/>
-          <w:sz w:val="21"/>
-          <w:szCs w:val="21"/>
+          <w:sz w:val="18"/>
+          <w:szCs w:val="18"/>
         </w:rPr>
         <w:t xml:space="preserve">Al-Fardos Management — Accounting &amp; ERP</w:t>
       </w:r>
@@ -419,8 +419,8 @@
           <w:i/>
           <w:iCs/>
           <w:color w:val="555555"/>
-          <w:sz w:val="20"/>
-          <w:szCs w:val="20"/>
+          <w:sz w:val="17"/>
+          <w:szCs w:val="17"/>
         </w:rPr>
         <w:t xml:space="preserve">	2026</w:t>
       </w:r>
@@ -428,7 +428,7 @@
     <w:p>
       <w:pPr>
         <w:keepNext/>
-        <w:spacing w:after="50" w:before="10"/>
+        <w:spacing w:after="20" w:before="0" w:line="240" w:lineRule="auto"/>
       </w:pPr>
       <w:r>
         <w:rPr>
@@ -436,8 +436,8 @@
           <w:i/>
           <w:iCs/>
           <w:color w:val="555555"/>
-          <w:sz w:val="20"/>
-          <w:szCs w:val="20"/>
+          <w:sz w:val="17"/>
+          <w:szCs w:val="17"/>
         </w:rPr>
         <w:t xml:space="preserve">Flutter • Riverpod • go_router • Firestore • App Check • Crashlytics • Windows &amp; Android</w:t>
       </w:r>
@@ -449,14 +449,14 @@
           <w:ilvl w:val="0"/>
           <w:numId w:val="2"/>
         </w:numPr>
-        <w:spacing w:after="30" w:before="30"/>
-      </w:pPr>
-      <w:r>
-        <w:rPr>
-          <w:rFonts w:ascii="Arial" w:cs="Arial" w:eastAsia="Arial" w:hAnsi="Arial"/>
-          <w:color w:val="555555"/>
-          <w:sz w:val="20"/>
-          <w:szCs w:val="20"/>
+        <w:spacing w:after="4" w:before="4" w:line="240" w:lineRule="auto"/>
+      </w:pPr>
+      <w:r>
+        <w:rPr>
+          <w:rFonts w:ascii="Arial" w:cs="Arial" w:eastAsia="Arial" w:hAnsi="Arial"/>
+          <w:color w:val="555555"/>
+          <w:sz w:val="17"/>
+          <w:szCs w:val="17"/>
         </w:rPr>
         <w:t xml:space="preserve">Arabic accounting system: sales and purchase invoices, customers, suppliers, cashboxes, expenses, stock, reports, PDF and Excel export</w:t>
       </w:r>
@@ -468,14 +468,14 @@
           <w:ilvl w:val="0"/>
           <w:numId w:val="2"/>
         </w:numPr>
-        <w:spacing w:after="30" w:before="30"/>
-      </w:pPr>
-      <w:r>
-        <w:rPr>
-          <w:rFonts w:ascii="Arial" w:cs="Arial" w:eastAsia="Arial" w:hAnsi="Arial"/>
-          <w:color w:val="555555"/>
-          <w:sz w:val="20"/>
-          <w:szCs w:val="20"/>
+        <w:spacing w:after="4" w:before="4" w:line="240" w:lineRule="auto"/>
+      </w:pPr>
+      <w:r>
+        <w:rPr>
+          <w:rFonts w:ascii="Arial" w:cs="Arial" w:eastAsia="Arial" w:hAnsi="Arial"/>
+          <w:color w:val="555555"/>
+          <w:sz w:val="17"/>
+          <w:szCs w:val="17"/>
         </w:rPr>
         <w:t xml:space="preserve">Every operation is one balanced double-entry posting written in a single atomic Firestore transaction; idempotent, integer money units</w:t>
       </w:r>
@@ -487,14 +487,14 @@
           <w:ilvl w:val="0"/>
           <w:numId w:val="2"/>
         </w:numPr>
-        <w:spacing w:after="30" w:before="30"/>
-      </w:pPr>
-      <w:r>
-        <w:rPr>
-          <w:rFonts w:ascii="Arial" w:cs="Arial" w:eastAsia="Arial" w:hAnsi="Arial"/>
-          <w:color w:val="555555"/>
-          <w:sz w:val="20"/>
-          <w:szCs w:val="20"/>
+        <w:spacing w:after="4" w:before="4" w:line="240" w:lineRule="auto"/>
+      </w:pPr>
+      <w:r>
+        <w:rPr>
+          <w:rFonts w:ascii="Arial" w:cs="Arial" w:eastAsia="Arial" w:hAnsi="Arial"/>
+          <w:color w:val="555555"/>
+          <w:sz w:val="17"/>
+          <w:szCs w:val="17"/>
         </w:rPr>
         <w:t xml:space="preserve">Security rules forbid deletes and unbalanced writes (emulator-tested); pure-Dart accounting core fully unit-tested; custom roles and audit log</w:t>
       </w:r>
@@ -503,9 +503,9 @@
       <w:pPr>
         <w:keepNext/>
         <w:tabs>
-          <w:tab w:val="right" w:pos="10080"/>
+          <w:tab w:val="right" w:pos="10720"/>
         </w:tabs>
-        <w:spacing w:after="30" w:before="150"/>
+        <w:spacing w:after="6" w:before="50" w:line="240" w:lineRule="auto"/>
       </w:pPr>
       <w:r>
         <w:rPr>
@@ -513,8 +513,8 @@
           <w:b/>
           <w:bCs/>
           <w:color w:val="1A1A2E"/>
-          <w:sz w:val="21"/>
-          <w:szCs w:val="21"/>
+          <w:sz w:val="18"/>
+          <w:szCs w:val="18"/>
         </w:rPr>
         <w:t xml:space="preserve">Length Factory — Order &amp; Inventory System</w:t>
       </w:r>
@@ -524,8 +524,8 @@
           <w:i/>
           <w:iCs/>
           <w:color w:val="555555"/>
-          <w:sz w:val="20"/>
-          <w:szCs w:val="20"/>
+          <w:sz w:val="17"/>
+          <w:szCs w:val="17"/>
         </w:rPr>
         <w:t xml:space="preserve">	2026</w:t>
       </w:r>
@@ -533,7 +533,7 @@
     <w:p>
       <w:pPr>
         <w:keepNext/>
-        <w:spacing w:after="50" w:before="10"/>
+        <w:spacing w:after="20" w:before="0" w:line="240" w:lineRule="auto"/>
       </w:pPr>
       <w:r>
         <w:rPr>
@@ -541,8 +541,8 @@
           <w:i/>
           <w:iCs/>
           <w:color w:val="555555"/>
-          <w:sz w:val="20"/>
-          <w:szCs w:val="20"/>
+          <w:sz w:val="17"/>
+          <w:szCs w:val="17"/>
         </w:rPr>
         <w:t xml:space="preserve">Flutter • Cubit • get_it • dartz • go_router • Firestore • Windows Desktop</w:t>
       </w:r>
@@ -554,14 +554,14 @@
           <w:ilvl w:val="0"/>
           <w:numId w:val="2"/>
         </w:numPr>
-        <w:spacing w:after="30" w:before="30"/>
-      </w:pPr>
-      <w:r>
-        <w:rPr>
-          <w:rFonts w:ascii="Arial" w:cs="Arial" w:eastAsia="Arial" w:hAnsi="Arial"/>
-          <w:color w:val="555555"/>
-          <w:sz w:val="20"/>
-          <w:szCs w:val="20"/>
+        <w:spacing w:after="4" w:before="4" w:line="240" w:lineRule="auto"/>
+      </w:pPr>
+      <w:r>
+        <w:rPr>
+          <w:rFonts w:ascii="Arial" w:cs="Arial" w:eastAsia="Arial" w:hAnsi="Arial"/>
+          <w:color w:val="555555"/>
+          <w:sz w:val="17"/>
+          <w:szCs w:val="17"/>
         </w:rPr>
         <w:t xml:space="preserve">Clean Architecture (data / domain / presentation) with Either-based error handling; 3 roles with atomic checkout and payment transactions</w:t>
       </w:r>
@@ -573,21 +573,21 @@
           <w:ilvl w:val="0"/>
           <w:numId w:val="2"/>
         </w:numPr>
-        <w:spacing w:after="30" w:before="30"/>
-      </w:pPr>
-      <w:r>
-        <w:rPr>
-          <w:rFonts w:ascii="Arial" w:cs="Arial" w:eastAsia="Arial" w:hAnsi="Arial"/>
-          <w:color w:val="555555"/>
-          <w:sz w:val="20"/>
-          <w:szCs w:val="20"/>
+        <w:spacing w:after="4" w:before="4" w:line="240" w:lineRule="auto"/>
+      </w:pPr>
+      <w:r>
+        <w:rPr>
+          <w:rFonts w:ascii="Arial" w:cs="Arial" w:eastAsia="Arial" w:hAnsi="Arial"/>
+          <w:color w:val="555555"/>
+          <w:sz w:val="17"/>
+          <w:szCs w:val="17"/>
         </w:rPr>
         <w:t xml:space="preserve">Security rules mirror UI permissions (workers never see prices); PDF invoices, live charts, one codebase for Android and Windows</w:t>
       </w:r>
     </w:p>
     <w:p>
       <w:pPr>
-        <w:spacing w:after="40" w:before="120"/>
+        <w:spacing w:after="6" w:before="40" w:line="240" w:lineRule="auto"/>
       </w:pPr>
       <w:r>
         <w:rPr>
@@ -595,8 +595,8 @@
           <w:b/>
           <w:bCs/>
           <w:color w:val="1A1A2E"/>
-          <w:sz w:val="20"/>
-          <w:szCs w:val="20"/>
+          <w:sz w:val="17"/>
+          <w:szCs w:val="17"/>
         </w:rPr>
         <w:t xml:space="preserve">Also: </w:t>
       </w:r>
@@ -604,8 +604,8 @@
         <w:rPr>
           <w:rFonts w:ascii="Arial" w:cs="Arial" w:eastAsia="Arial" w:hAnsi="Arial"/>
           <w:color w:val="555555"/>
-          <w:sz w:val="20"/>
-          <w:szCs w:val="20"/>
+          <w:sz w:val="17"/>
+          <w:szCs w:val="17"/>
         </w:rPr>
         <w:t xml:space="preserve">Eyan (doctor booking, Arabic/English)  •  Smart Institute (student &amp; doctor portal)  •  Book Store  •  Taskati</w:t>
       </w:r>
@@ -614,9 +614,9 @@
       <w:pPr>
         <w:keepNext/>
         <w:pBdr>
-          <w:bottom w:val="single" w:color="6B3FA0" w:sz="4" w:space="4"/>
+          <w:bottom w:val="single" w:color="6B3FA0" w:sz="4" w:space="2"/>
         </w:pBdr>
-        <w:spacing w:after="80" w:before="240"/>
+        <w:spacing w:after="36" w:before="70" w:line="240" w:lineRule="auto"/>
       </w:pPr>
       <w:r>
         <w:rPr>
@@ -624,8 +624,8 @@
           <w:b/>
           <w:bCs/>
           <w:color w:val="6B3FA0"/>
-          <w:sz w:val="22"/>
-          <w:szCs w:val="22"/>
+          <w:sz w:val="19"/>
+          <w:szCs w:val="19"/>
         </w:rPr>
         <w:t xml:space="preserve">WORK EXPERIENCE</w:t>
       </w:r>
@@ -634,9 +634,9 @@
       <w:pPr>
         <w:keepNext/>
         <w:tabs>
-          <w:tab w:val="right" w:pos="10080"/>
+          <w:tab w:val="right" w:pos="10720"/>
         </w:tabs>
-        <w:spacing w:after="30" w:before="150"/>
+        <w:spacing w:after="6" w:before="50" w:line="240" w:lineRule="auto"/>
       </w:pPr>
       <w:r>
         <w:rPr>
@@ -644,8 +644,8 @@
           <w:b/>
           <w:bCs/>
           <w:color w:val="1A1A2E"/>
-          <w:sz w:val="21"/>
-          <w:szCs w:val="21"/>
+          <w:sz w:val="18"/>
+          <w:szCs w:val="18"/>
         </w:rPr>
         <w:t xml:space="preserve">Flutter Developer — Al-Fardos Metal Factory</w:t>
       </w:r>
@@ -655,8 +655,8 @@
           <w:i/>
           <w:iCs/>
           <w:color w:val="555555"/>
-          <w:sz w:val="20"/>
-          <w:szCs w:val="20"/>
+          <w:sz w:val="17"/>
+          <w:szCs w:val="17"/>
         </w:rPr>
         <w:t xml:space="preserve">	Jan 2024 – Present</w:t>
       </w:r>
@@ -664,7 +664,7 @@
     <w:p>
       <w:pPr>
         <w:keepNext/>
-        <w:spacing w:after="50" w:before="10"/>
+        <w:spacing w:after="20" w:before="0" w:line="240" w:lineRule="auto"/>
       </w:pPr>
       <w:r>
         <w:rPr>
@@ -672,8 +672,8 @@
           <w:i/>
           <w:iCs/>
           <w:color w:val="555555"/>
-          <w:sz w:val="20"/>
-          <w:szCs w:val="20"/>
+          <w:sz w:val="17"/>
+          <w:szCs w:val="17"/>
         </w:rPr>
         <w:t xml:space="preserve">Cairo, Egypt  •  Family business — factory management &amp; operations</w:t>
       </w:r>
@@ -685,14 +685,14 @@
           <w:ilvl w:val="0"/>
           <w:numId w:val="2"/>
         </w:numPr>
-        <w:spacing w:after="30" w:before="30"/>
-      </w:pPr>
-      <w:r>
-        <w:rPr>
-          <w:rFonts w:ascii="Arial" w:cs="Arial" w:eastAsia="Arial" w:hAnsi="Arial"/>
-          <w:color w:val="555555"/>
-          <w:sz w:val="20"/>
-          <w:szCs w:val="20"/>
+        <w:spacing w:after="4" w:before="4" w:line="240" w:lineRule="auto"/>
+      </w:pPr>
+      <w:r>
+        <w:rPr>
+          <w:rFonts w:ascii="Arial" w:cs="Arial" w:eastAsia="Arial" w:hAnsi="Arial"/>
+          <w:color w:val="555555"/>
+          <w:sz w:val="17"/>
+          <w:szCs w:val="17"/>
         </w:rPr>
         <w:t xml:space="preserve">Designed and built Al-Fardos Factory from scratch as a production tool used daily by factory staff and clients</w:t>
       </w:r>
@@ -704,14 +704,14 @@
           <w:ilvl w:val="0"/>
           <w:numId w:val="2"/>
         </w:numPr>
-        <w:spacing w:after="30" w:before="30"/>
-      </w:pPr>
-      <w:r>
-        <w:rPr>
-          <w:rFonts w:ascii="Arial" w:cs="Arial" w:eastAsia="Arial" w:hAnsi="Arial"/>
-          <w:color w:val="555555"/>
-          <w:sz w:val="20"/>
-          <w:szCs w:val="20"/>
+        <w:spacing w:after="4" w:before="4" w:line="240" w:lineRule="auto"/>
+      </w:pPr>
+      <w:r>
+        <w:rPr>
+          <w:rFonts w:ascii="Arial" w:cs="Arial" w:eastAsia="Arial" w:hAnsi="Arial"/>
+          <w:color w:val="555555"/>
+          <w:sz w:val="17"/>
+          <w:szCs w:val="17"/>
         </w:rPr>
         <w:t xml:space="preserve">Built Al-Fardos Management, a double-entry accounting system for Windows and Android, with tested ledger logic and security rules</w:t>
       </w:r>
@@ -723,14 +723,14 @@
           <w:ilvl w:val="0"/>
           <w:numId w:val="2"/>
         </w:numPr>
-        <w:spacing w:after="30" w:before="30"/>
-      </w:pPr>
-      <w:r>
-        <w:rPr>
-          <w:rFonts w:ascii="Arial" w:cs="Arial" w:eastAsia="Arial" w:hAnsi="Arial"/>
-          <w:color w:val="555555"/>
-          <w:sz w:val="20"/>
-          <w:szCs w:val="20"/>
+        <w:spacing w:after="4" w:before="4" w:line="240" w:lineRule="auto"/>
+      </w:pPr>
+      <w:r>
+        <w:rPr>
+          <w:rFonts w:ascii="Arial" w:cs="Arial" w:eastAsia="Arial" w:hAnsi="Arial"/>
+          <w:color w:val="555555"/>
+          <w:sz w:val="17"/>
+          <w:szCs w:val="17"/>
         </w:rPr>
         <w:t xml:space="preserve">Owned the Firebase backend: Firestore schema design, security rules, storage and push notifications</w:t>
       </w:r>
@@ -739,9 +739,9 @@
       <w:pPr>
         <w:keepNext/>
         <w:tabs>
-          <w:tab w:val="right" w:pos="10080"/>
+          <w:tab w:val="right" w:pos="10720"/>
         </w:tabs>
-        <w:spacing w:after="30" w:before="150"/>
+        <w:spacing w:after="6" w:before="50" w:line="240" w:lineRule="auto"/>
       </w:pPr>
       <w:r>
         <w:rPr>
@@ -749,8 +749,8 @@
           <w:b/>
           <w:bCs/>
           <w:color w:val="1A1A2E"/>
-          <w:sz w:val="21"/>
-          <w:szCs w:val="21"/>
+          <w:sz w:val="18"/>
+          <w:szCs w:val="18"/>
         </w:rPr>
         <w:t xml:space="preserve">Mobile Development Engineer — EraaSoft</w:t>
       </w:r>
@@ -760,8 +760,8 @@
           <w:i/>
           <w:iCs/>
           <w:color w:val="555555"/>
-          <w:sz w:val="20"/>
-          <w:szCs w:val="20"/>
+          <w:sz w:val="17"/>
+          <w:szCs w:val="17"/>
         </w:rPr>
         <w:t xml:space="preserve">	Jan 2024 – Oct 2025</w:t>
       </w:r>
@@ -769,7 +769,7 @@
     <w:p>
       <w:pPr>
         <w:keepNext/>
-        <w:spacing w:after="50" w:before="10"/>
+        <w:spacing w:after="20" w:before="0" w:line="240" w:lineRule="auto"/>
       </w:pPr>
       <w:r>
         <w:rPr>
@@ -777,8 +777,8 @@
           <w:i/>
           <w:iCs/>
           <w:color w:val="555555"/>
-          <w:sz w:val="20"/>
-          <w:szCs w:val="20"/>
+          <w:sz w:val="17"/>
+          <w:szCs w:val="17"/>
         </w:rPr>
         <w:t xml:space="preserve">Cairo, Egypt</w:t>
       </w:r>
@@ -790,14 +790,14 @@
           <w:ilvl w:val="0"/>
           <w:numId w:val="2"/>
         </w:numPr>
-        <w:spacing w:after="30" w:before="30"/>
-      </w:pPr>
-      <w:r>
-        <w:rPr>
-          <w:rFonts w:ascii="Arial" w:cs="Arial" w:eastAsia="Arial" w:hAnsi="Arial"/>
-          <w:color w:val="555555"/>
-          <w:sz w:val="20"/>
-          <w:szCs w:val="20"/>
+        <w:spacing w:after="4" w:before="4" w:line="240" w:lineRule="auto"/>
+      </w:pPr>
+      <w:r>
+        <w:rPr>
+          <w:rFonts w:ascii="Arial" w:cs="Arial" w:eastAsia="Arial" w:hAnsi="Arial"/>
+          <w:color w:val="555555"/>
+          <w:sz w:val="17"/>
+          <w:szCs w:val="17"/>
         </w:rPr>
         <w:t xml:space="preserve">Designed, developed, and deployed cross-platform mobile apps using Flutter and Dart</w:t>
       </w:r>
@@ -809,14 +809,14 @@
           <w:ilvl w:val="0"/>
           <w:numId w:val="2"/>
         </w:numPr>
-        <w:spacing w:after="30" w:before="30"/>
-      </w:pPr>
-      <w:r>
-        <w:rPr>
-          <w:rFonts w:ascii="Arial" w:cs="Arial" w:eastAsia="Arial" w:hAnsi="Arial"/>
-          <w:color w:val="555555"/>
-          <w:sz w:val="20"/>
-          <w:szCs w:val="20"/>
+        <w:spacing w:after="4" w:before="4" w:line="240" w:lineRule="auto"/>
+      </w:pPr>
+      <w:r>
+        <w:rPr>
+          <w:rFonts w:ascii="Arial" w:cs="Arial" w:eastAsia="Arial" w:hAnsi="Arial"/>
+          <w:color w:val="555555"/>
+          <w:sz w:val="17"/>
+          <w:szCs w:val="17"/>
         </w:rPr>
         <w:t xml:space="preserve">Collaborated with designers and backend engineers to deliver smooth, high-performing user experiences</w:t>
       </w:r>
@@ -828,14 +828,14 @@
           <w:ilvl w:val="0"/>
           <w:numId w:val="2"/>
         </w:numPr>
-        <w:spacing w:after="30" w:before="30"/>
-      </w:pPr>
-      <w:r>
-        <w:rPr>
-          <w:rFonts w:ascii="Arial" w:cs="Arial" w:eastAsia="Arial" w:hAnsi="Arial"/>
-          <w:color w:val="555555"/>
-          <w:sz w:val="20"/>
-          <w:szCs w:val="20"/>
+        <w:spacing w:after="4" w:before="4" w:line="240" w:lineRule="auto"/>
+      </w:pPr>
+      <w:r>
+        <w:rPr>
+          <w:rFonts w:ascii="Arial" w:cs="Arial" w:eastAsia="Arial" w:hAnsi="Arial"/>
+          <w:color w:val="555555"/>
+          <w:sz w:val="17"/>
+          <w:szCs w:val="17"/>
         </w:rPr>
         <w:t xml:space="preserve">Optimized app performance, implemented modern UI/UX principles, and ensured code scalability</w:t>
       </w:r>
@@ -844,9 +844,9 @@
       <w:pPr>
         <w:keepNext/>
         <w:pBdr>
-          <w:bottom w:val="single" w:color="6B3FA0" w:sz="4" w:space="4"/>
+          <w:bottom w:val="single" w:color="6B3FA0" w:sz="4" w:space="2"/>
         </w:pBdr>
-        <w:spacing w:after="80" w:before="240"/>
+        <w:spacing w:after="36" w:before="70" w:line="240" w:lineRule="auto"/>
       </w:pPr>
       <w:r>
         <w:rPr>
@@ -854,8 +854,8 @@
           <w:b/>
           <w:bCs/>
           <w:color w:val="6B3FA0"/>
-          <w:sz w:val="22"/>
-          <w:szCs w:val="22"/>
+          <w:sz w:val="19"/>
+          <w:szCs w:val="19"/>
         </w:rPr>
         <w:t xml:space="preserve">EDUCATION</w:t>
       </w:r>
@@ -864,9 +864,9 @@
       <w:pPr>
         <w:keepNext/>
         <w:tabs>
-          <w:tab w:val="right" w:pos="10080"/>
+          <w:tab w:val="right" w:pos="10720"/>
         </w:tabs>
-        <w:spacing w:after="30" w:before="150"/>
+        <w:spacing w:after="6" w:before="50" w:line="240" w:lineRule="auto"/>
       </w:pPr>
       <w:r>
         <w:rPr>
@@ -874,8 +874,8 @@
           <w:b/>
           <w:bCs/>
           <w:color w:val="1A1A2E"/>
-          <w:sz w:val="21"/>
-          <w:szCs w:val="21"/>
+          <w:sz w:val="18"/>
+          <w:szCs w:val="18"/>
         </w:rPr>
         <w:t xml:space="preserve">Bachelor's Degree in Computer Science &amp; Information Systems</w:t>
       </w:r>
@@ -885,8 +885,8 @@
           <w:i/>
           <w:iCs/>
           <w:color w:val="555555"/>
-          <w:sz w:val="20"/>
-          <w:szCs w:val="20"/>
+          <w:sz w:val="17"/>
+          <w:szCs w:val="17"/>
         </w:rPr>
         <w:t xml:space="preserve">	Sep 2021 – 2026</w:t>
       </w:r>
@@ -894,7 +894,7 @@
     <w:p>
       <w:pPr>
         <w:keepNext/>
-        <w:spacing w:after="50" w:before="10"/>
+        <w:spacing w:after="20" w:before="0" w:line="240" w:lineRule="auto"/>
       </w:pPr>
       <w:r>
         <w:rPr>
@@ -902,8 +902,8 @@
           <w:i/>
           <w:iCs/>
           <w:color w:val="555555"/>
-          <w:sz w:val="20"/>
-          <w:szCs w:val="20"/>
+          <w:sz w:val="17"/>
+          <w:szCs w:val="17"/>
         </w:rPr>
         <w:t xml:space="preserve">October University, Faculty of Computer Science — Cairo, Egypt  •  Graduated</w:t>
       </w:r>
@@ -915,14 +915,14 @@
           <w:ilvl w:val="0"/>
           <w:numId w:val="2"/>
         </w:numPr>
-        <w:spacing w:after="30" w:before="30"/>
-      </w:pPr>
-      <w:r>
-        <w:rPr>
-          <w:rFonts w:ascii="Arial" w:cs="Arial" w:eastAsia="Arial" w:hAnsi="Arial"/>
-          <w:color w:val="555555"/>
-          <w:sz w:val="20"/>
-          <w:szCs w:val="20"/>
+        <w:spacing w:after="4" w:before="4" w:line="240" w:lineRule="auto"/>
+      </w:pPr>
+      <w:r>
+        <w:rPr>
+          <w:rFonts w:ascii="Arial" w:cs="Arial" w:eastAsia="Arial" w:hAnsi="Arial"/>
+          <w:color w:val="555555"/>
+          <w:sz w:val="17"/>
+          <w:szCs w:val="17"/>
         </w:rPr>
         <w:t xml:space="preserve">Focus areas: Mobile App Development, Flutter &amp; Dart, Software Engineering</w:t>
       </w:r>
@@ -931,9 +931,9 @@
       <w:pPr>
         <w:keepNext/>
         <w:pBdr>
-          <w:bottom w:val="single" w:color="6B3FA0" w:sz="4" w:space="4"/>
+          <w:bottom w:val="single" w:color="6B3FA0" w:sz="4" w:space="2"/>
         </w:pBdr>
-        <w:spacing w:after="80" w:before="240"/>
+        <w:spacing w:after="36" w:before="70" w:line="240" w:lineRule="auto"/>
       </w:pPr>
       <w:r>
         <w:rPr>
@@ -941,15 +941,15 @@
           <w:b/>
           <w:bCs/>
           <w:color w:val="6B3FA0"/>
-          <w:sz w:val="22"/>
-          <w:szCs w:val="22"/>
+          <w:sz w:val="19"/>
+          <w:szCs w:val="19"/>
         </w:rPr>
         <w:t xml:space="preserve">TECHNICAL SKILLS</w:t>
       </w:r>
     </w:p>
     <w:p>
       <w:pPr>
-        <w:spacing w:after="40" w:before="40"/>
+        <w:spacing w:after="4" w:before="4" w:line="240" w:lineRule="auto"/>
       </w:pPr>
       <w:r>
         <w:rPr>
@@ -957,8 +957,8 @@
           <w:b/>
           <w:bCs/>
           <w:color w:val="6B3FA0"/>
-          <w:sz w:val="20"/>
-          <w:szCs w:val="20"/>
+          <w:sz w:val="17"/>
+          <w:szCs w:val="17"/>
         </w:rPr>
         <w:t xml:space="preserve">Mobile &amp; Desktop:  </w:t>
       </w:r>
@@ -966,15 +966,15 @@
         <w:rPr>
           <w:rFonts w:ascii="Arial" w:cs="Arial" w:eastAsia="Arial" w:hAnsi="Arial"/>
           <w:color w:val="555555"/>
-          <w:sz w:val="20"/>
-          <w:szCs w:val="20"/>
+          <w:sz w:val="17"/>
+          <w:szCs w:val="17"/>
         </w:rPr>
         <w:t xml:space="preserve">Flutter, Dart, Material 3, responsive shells, Arabic RTL / i18n, Windows Desktop</w:t>
       </w:r>
     </w:p>
     <w:p>
       <w:pPr>
-        <w:spacing w:after="40" w:before="40"/>
+        <w:spacing w:after="4" w:before="4" w:line="240" w:lineRule="auto"/>
       </w:pPr>
       <w:r>
         <w:rPr>
@@ -982,8 +982,8 @@
           <w:b/>
           <w:bCs/>
           <w:color w:val="6B3FA0"/>
-          <w:sz w:val="20"/>
-          <w:szCs w:val="20"/>
+          <w:sz w:val="17"/>
+          <w:szCs w:val="17"/>
         </w:rPr>
         <w:t xml:space="preserve">State &amp; Architecture:  </w:t>
       </w:r>
@@ -991,15 +991,15 @@
         <w:rPr>
           <w:rFonts w:ascii="Arial" w:cs="Arial" w:eastAsia="Arial" w:hAnsi="Arial"/>
           <w:color w:val="555555"/>
-          <w:sz w:val="20"/>
-          <w:szCs w:val="20"/>
+          <w:sz w:val="17"/>
+          <w:szCs w:val="17"/>
         </w:rPr>
         <w:t xml:space="preserve">Bloc / Cubit, Riverpod, Provider, Clean Architecture, Repository pattern, get_it, go_router, Freezed</w:t>
       </w:r>
     </w:p>
     <w:p>
       <w:pPr>
-        <w:spacing w:after="40" w:before="40"/>
+        <w:spacing w:after="4" w:before="4" w:line="240" w:lineRule="auto"/>
       </w:pPr>
       <w:r>
         <w:rPr>
@@ -1007,8 +1007,8 @@
           <w:b/>
           <w:bCs/>
           <w:color w:val="6B3FA0"/>
-          <w:sz w:val="20"/>
-          <w:szCs w:val="20"/>
+          <w:sz w:val="17"/>
+          <w:szCs w:val="17"/>
         </w:rPr>
         <w:t xml:space="preserve">Firebase:  </w:t>
       </w:r>
@@ -1016,15 +1016,15 @@
         <w:rPr>
           <w:rFonts w:ascii="Arial" w:cs="Arial" w:eastAsia="Arial" w:hAnsi="Arial"/>
           <w:color w:val="555555"/>
-          <w:sz w:val="20"/>
-          <w:szCs w:val="20"/>
+          <w:sz w:val="17"/>
+          <w:szCs w:val="17"/>
         </w:rPr>
         <w:t xml:space="preserve">Firestore, Auth, Storage, Cloud Messaging, App Check, Crashlytics, Security Rules</w:t>
       </w:r>
     </w:p>
     <w:p>
       <w:pPr>
-        <w:spacing w:after="40" w:before="40"/>
+        <w:spacing w:after="4" w:before="4" w:line="240" w:lineRule="auto"/>
       </w:pPr>
       <w:r>
         <w:rPr>
@@ -1032,8 +1032,8 @@
           <w:b/>
           <w:bCs/>
           <w:color w:val="6B3FA0"/>
-          <w:sz w:val="20"/>
-          <w:szCs w:val="20"/>
+          <w:sz w:val="17"/>
+          <w:szCs w:val="17"/>
         </w:rPr>
         <w:t xml:space="preserve">Supabase &amp; SQL:  </w:t>
       </w:r>
@@ -1041,15 +1041,15 @@
         <w:rPr>
           <w:rFonts w:ascii="Arial" w:cs="Arial" w:eastAsia="Arial" w:hAnsi="Arial"/>
           <w:color w:val="555555"/>
-          <w:sz w:val="20"/>
-          <w:szCs w:val="20"/>
+          <w:sz w:val="17"/>
+          <w:szCs w:val="17"/>
         </w:rPr>
         <w:t xml:space="preserve">PostgreSQL, Row Level Security, RPC functions, Edge Functions, Realtime, migrations</w:t>
       </w:r>
     </w:p>
     <w:p>
       <w:pPr>
-        <w:spacing w:after="40" w:before="40"/>
+        <w:spacing w:after="4" w:before="4" w:line="240" w:lineRule="auto"/>
       </w:pPr>
       <w:r>
         <w:rPr>
@@ -1057,8 +1057,8 @@
           <w:b/>
           <w:bCs/>
           <w:color w:val="6B3FA0"/>
-          <w:sz w:val="20"/>
-          <w:szCs w:val="20"/>
+          <w:sz w:val="17"/>
+          <w:szCs w:val="17"/>
         </w:rPr>
         <w:t xml:space="preserve">Web:  </w:t>
       </w:r>
@@ -1066,15 +1066,15 @@
         <w:rPr>
           <w:rFonts w:ascii="Arial" w:cs="Arial" w:eastAsia="Arial" w:hAnsi="Arial"/>
           <w:color w:val="555555"/>
-          <w:sz w:val="20"/>
-          <w:szCs w:val="20"/>
+          <w:sz w:val="17"/>
+          <w:szCs w:val="17"/>
         </w:rPr>
         <w:t xml:space="preserve">Next.js, React, TypeScript, Tailwind CSS, Cloudflare Workers, REST APIs</w:t>
       </w:r>
     </w:p>
     <w:p>
       <w:pPr>
-        <w:spacing w:after="40" w:before="40"/>
+        <w:spacing w:after="4" w:before="4" w:line="240" w:lineRule="auto"/>
       </w:pPr>
       <w:r>
         <w:rPr>
@@ -1082,8 +1082,8 @@
           <w:b/>
           <w:bCs/>
           <w:color w:val="6B3FA0"/>
-          <w:sz w:val="20"/>
-          <w:szCs w:val="20"/>
+          <w:sz w:val="17"/>
+          <w:szCs w:val="17"/>
         </w:rPr>
         <w:t xml:space="preserve">Quality &amp; Tools:  </w:t>
       </w:r>
@@ -1091,8 +1091,8 @@
         <w:rPr>
           <w:rFonts w:ascii="Arial" w:cs="Arial" w:eastAsia="Arial" w:hAnsi="Arial"/>
           <w:color w:val="555555"/>
-          <w:sz w:val="20"/>
-          <w:szCs w:val="20"/>
+          <w:sz w:val="17"/>
+          <w:szCs w:val="17"/>
         </w:rPr>
         <w:t xml:space="preserve">Unit &amp; widget tests, security rules testing, Git, GitHub, Android Studio, VS Code, Postman</w:t>
       </w:r>
@@ -1101,9 +1101,9 @@
       <w:pPr>
         <w:keepNext/>
         <w:pBdr>
-          <w:bottom w:val="single" w:color="6B3FA0" w:sz="4" w:space="4"/>
+          <w:bottom w:val="single" w:color="6B3FA0" w:sz="4" w:space="2"/>
         </w:pBdr>
-        <w:spacing w:after="80" w:before="240"/>
+        <w:spacing w:after="36" w:before="70" w:line="240" w:lineRule="auto"/>
       </w:pPr>
       <w:r>
         <w:rPr>
@@ -1111,15 +1111,15 @@
           <w:b/>
           <w:bCs/>
           <w:color w:val="6B3FA0"/>
-          <w:sz w:val="22"/>
-          <w:szCs w:val="22"/>
+          <w:sz w:val="19"/>
+          <w:szCs w:val="19"/>
         </w:rPr>
         <w:t xml:space="preserve">ADDITIONAL INFORMATION</w:t>
       </w:r>
     </w:p>
     <w:p>
       <w:pPr>
-        <w:spacing w:after="40" w:before="40"/>
+        <w:spacing w:after="4" w:before="4" w:line="240" w:lineRule="auto"/>
       </w:pPr>
       <w:r>
         <w:rPr>
@@ -1127,8 +1127,8 @@
           <w:b/>
           <w:bCs/>
           <w:color w:val="6B3FA0"/>
-          <w:sz w:val="20"/>
-          <w:szCs w:val="20"/>
+          <w:sz w:val="17"/>
+          <w:szCs w:val="17"/>
         </w:rPr>
         <w:t xml:space="preserve">Languages:  </w:t>
       </w:r>
@@ -1136,15 +1136,15 @@
         <w:rPr>
           <w:rFonts w:ascii="Arial" w:cs="Arial" w:eastAsia="Arial" w:hAnsi="Arial"/>
           <w:color w:val="555555"/>
-          <w:sz w:val="20"/>
-          <w:szCs w:val="20"/>
+          <w:sz w:val="17"/>
+          <w:szCs w:val="17"/>
         </w:rPr>
         <w:t xml:space="preserve">Arabic (Native), English (Professional)</w:t>
       </w:r>
     </w:p>
     <w:p>
       <w:pPr>
-        <w:spacing w:after="40" w:before="40"/>
+        <w:spacing w:after="4" w:before="4" w:line="240" w:lineRule="auto"/>
       </w:pPr>
       <w:r>
         <w:rPr>
@@ -1152,8 +1152,8 @@
           <w:b/>
           <w:bCs/>
           <w:color w:val="6B3FA0"/>
-          <w:sz w:val="20"/>
-          <w:szCs w:val="20"/>
+          <w:sz w:val="17"/>
+          <w:szCs w:val="17"/>
         </w:rPr>
         <w:t xml:space="preserve">Certifications:  </w:t>
       </w:r>
@@ -1161,15 +1161,15 @@
         <w:rPr>
           <w:rFonts w:ascii="Arial" w:cs="Arial" w:eastAsia="Arial" w:hAnsi="Arial"/>
           <w:color w:val="555555"/>
-          <w:sz w:val="20"/>
-          <w:szCs w:val="20"/>
+          <w:sz w:val="17"/>
+          <w:szCs w:val="17"/>
         </w:rPr>
         <w:t xml:space="preserve">Flutter Development Training – EraaSoft  |  Google Developer Fundamentals</w:t>
       </w:r>
     </w:p>
     <w:p>
       <w:pPr>
-        <w:spacing w:after="40" w:before="40"/>
+        <w:spacing w:after="4" w:before="4" w:line="240" w:lineRule="auto"/>
       </w:pPr>
       <w:r>
         <w:rPr>
@@ -1177,8 +1177,8 @@
           <w:b/>
           <w:bCs/>
           <w:color w:val="6B3FA0"/>
-          <w:sz w:val="20"/>
-          <w:szCs w:val="20"/>
+          <w:sz w:val="17"/>
+          <w:szCs w:val="17"/>
         </w:rPr>
         <w:t xml:space="preserve">Platforms:  </w:t>
       </w:r>
@@ -1186,15 +1186,15 @@
         <w:rPr>
           <w:rFonts w:ascii="Arial" w:cs="Arial" w:eastAsia="Arial" w:hAnsi="Arial"/>
           <w:color w:val="555555"/>
-          <w:sz w:val="20"/>
-          <w:szCs w:val="20"/>
+          <w:sz w:val="17"/>
+          <w:szCs w:val="17"/>
         </w:rPr>
         <w:t xml:space="preserve">Upwork (active freelancer), GitHub (open portfolio), osama-yosef.github.io/osama-yosef-portfolio</w:t>
       </w:r>
     </w:p>
     <w:sectPr>
       <w:pgSz w:w="12240" w:h="15840" w:orient="portrait"/>
-      <w:pgMar w:top="1000" w:right="1080" w:bottom="1000" w:left="1080" w:header="708" w:footer="708" w:gutter="0"/>
+      <w:pgMar w:top="420" w:right="760" w:bottom="320" w:left="760" w:header="708" w:footer="708" w:gutter="0"/>
       <w:pgNumType/>
       <w:docGrid w:linePitch="360"/>
     </w:sectPr>

</xml_diff>